<commit_message>
Update 161_Guide_Complet_RAG_Cas_Usage_TransferAI with full cover and sector sections
Adds proper cover (Médard Sery / Soulemane Konaté credits), completes
sections 4.5-4.7 (Éducation, Juridique, Et au-delà), and fixes the
document's font (was unset, falling back to the renderer's default
instead of Arial).

Co-Authored-By: Claude Sonnet 5 <noreply@anthropic.com>
</commit_message>
<xml_diff>
--- a/docs/transferai-admin/161_Guide_Complet_RAG_Cas_Usage_TransferAI.docx
+++ b/docs/transferai-admin/161_Guide_Complet_RAG_Cas_Usage_TransferAI.docx
@@ -2,79 +2,6 @@
 <file path=word/document.xml><?xml version="1.0" encoding="utf-8"?>
 <w:document xmlns:wpc="http://schemas.microsoft.com/office/word/2010/wordprocessingCanvas" xmlns:mc="http://schemas.openxmlformats.org/markup-compatibility/2006" xmlns:o="urn:schemas-microsoft-com:office:office" xmlns:r="http://schemas.openxmlformats.org/officeDocument/2006/relationships" xmlns:m="http://schemas.openxmlformats.org/officeDocument/2006/math" xmlns:v="urn:schemas-microsoft-com:vml" xmlns:wp14="http://schemas.microsoft.com/office/word/2010/wordprocessingDrawing" xmlns:wp="http://schemas.openxmlformats.org/drawingml/2006/wordprocessingDrawing" xmlns:w10="urn:schemas-microsoft-com:office:word" xmlns:w="http://schemas.openxmlformats.org/wordprocessingml/2006/main" xmlns:w14="http://schemas.microsoft.com/office/word/2010/wordml" xmlns:w15="http://schemas.microsoft.com/office/word/2012/wordml" xmlns:wpg="http://schemas.microsoft.com/office/word/2010/wordprocessingGroup" xmlns:wpi="http://schemas.microsoft.com/office/word/2010/wordprocessingInk" xmlns:wne="http://schemas.microsoft.com/office/word/2006/wordml" xmlns:wps="http://schemas.microsoft.com/office/word/2010/wordprocessingShape" xmlns:cx="http://schemas.microsoft.com/office/drawing/2014/chartex" xmlns:cx1="http://schemas.microsoft.com/office/drawing/2015/9/8/chartex" xmlns:cx2="http://schemas.microsoft.com/office/drawing/2015/10/21/chartex" xmlns:cx3="http://schemas.microsoft.com/office/drawing/2016/5/9/chartex" xmlns:cx4="http://schemas.microsoft.com/office/drawing/2016/5/10/chartex" xmlns:cx5="http://schemas.microsoft.com/office/drawing/2016/5/11/chartex" xmlns:cx6="http://schemas.microsoft.com/office/drawing/2016/5/12/chartex" xmlns:cx7="http://schemas.microsoft.com/office/drawing/2016/5/13/chartex" xmlns:cx8="http://schemas.microsoft.com/office/drawing/2016/5/14/chartex" xmlns:aink="http://schemas.microsoft.com/office/drawing/2016/ink" xmlns:am3d="http://schemas.microsoft.com/office/drawing/2017/model3d" xmlns:w16cex="http://schemas.microsoft.com/office/word/2018/wordml/cex" xmlns:w16cid="http://schemas.microsoft.com/office/word/2016/wordml/cid" xmlns:w16="http://schemas.microsoft.com/office/word/2018/wordml" xmlns:w16sdtdh="http://schemas.microsoft.com/office/word/2020/wordml/sdtdatahash" xmlns:w16se="http://schemas.microsoft.com/office/word/2015/wordml/symex" mc:Ignorable="w14 w15 wp14">
   <w:body>
-    <w:p>
-      <w:pPr>
-        <w:shd w:fill="10263F" w:val="clear"/>
-        <w:spacing w:after="0" w:before="0"/>
-      </w:pPr>
-      <w:r>
-        <w:rPr>
-          <w:sz w:val="2"/>
-          <w:szCs w:val="2"/>
-        </w:rPr>
-        <w:t xml:space="preserve"> </w:t>
-      </w:r>
-    </w:p>
-    <w:p>
-      <w:pPr>
-        <w:spacing w:after="60" w:before="260"/>
-      </w:pPr>
-      <w:r>
-        <w:rPr>
-          <w:b/>
-          <w:bCs/>
-          <w:color w:val="1E8A99"/>
-          <w:sz w:val="18"/>
-          <w:szCs w:val="18"/>
-        </w:rPr>
-        <w:t xml:space="preserve">TRANSFERAI AFRICA · GUIDE RAG</w:t>
-      </w:r>
-    </w:p>
-    <w:p>
-      <w:pPr>
-        <w:spacing w:after="60"/>
-      </w:pPr>
-      <w:r>
-        <w:rPr>
-          <w:b/>
-          <w:bCs/>
-          <w:color w:val="10263F"/>
-          <w:sz w:val="42"/>
-          <w:szCs w:val="42"/>
-        </w:rPr>
-        <w:t xml:space="preserve">LE RAG EN ENTREPRISE</w:t>
-      </w:r>
-    </w:p>
-    <w:p>
-      <w:pPr>
-        <w:spacing w:after="60"/>
-      </w:pPr>
-      <w:r>
-        <w:rPr>
-          <w:b/>
-          <w:bCs/>
-          <w:color w:val="10263F"/>
-          <w:sz w:val="26"/>
-          <w:szCs w:val="26"/>
-        </w:rPr>
-        <w:t xml:space="preserve">Guide complet, cas d'usage et retour d'expérience TransferAI Africa</w:t>
-      </w:r>
-    </w:p>
-    <w:p>
-      <w:pPr>
-        <w:spacing w:after="280"/>
-      </w:pPr>
-      <w:r>
-        <w:rPr>
-          <w:i/>
-          <w:iCs/>
-          <w:color w:val="6B7280"/>
-          <w:sz w:val="20"/>
-          <w:szCs w:val="20"/>
-        </w:rPr>
-        <w:t xml:space="preserve">Définition, fonctionnement, retour sur investissement et déclinaisons sectorielles — un cas d'usage réel, réplicable dans toute organisation.</w:t>
-      </w:r>
-    </w:p>
     <w:tbl>
       <w:tblPr>
         <w:tblW w:type="dxa" w:w="10080"/>
@@ -88,155 +15,49 @@
         </w:tblBorders>
       </w:tblPr>
       <w:tblGrid>
-        <w:gridCol w:w="2822"/>
-        <w:gridCol w:w="7257"/>
+        <w:gridCol w:w="10080"/>
       </w:tblGrid>
       <w:tr>
         <w:tc>
           <w:tcPr>
-            <w:tcW w:type="dxa" w:w="2822"/>
-            <w:shd w:fill="10263F" w:val="clear"/>
-            <w:tcMar>
-              <w:top w:type="dxa" w:w="100"/>
-              <w:left w:type="dxa" w:w="120"/>
-              <w:bottom w:type="dxa" w:w="100"/>
-              <w:right w:type="dxa" w:w="120"/>
-            </w:tcMar>
-          </w:tcPr>
-          <w:p>
+            <w:tcW w:type="dxa" w:w="10080"/>
+            <w:shd w:fill="1B3F6E" w:val="clear"/>
+            <w:tcMar>
+              <w:top w:type="dxa" w:w="260"/>
+              <w:left w:type="dxa" w:w="200"/>
+              <w:bottom w:type="dxa" w:w="260"/>
+              <w:right w:type="dxa" w:w="200"/>
+            </w:tcMar>
+          </w:tcPr>
+          <w:p>
+            <w:pPr>
+              <w:spacing w:after="60"/>
+              <w:jc w:val="center"/>
+            </w:pPr>
             <w:r>
               <w:rPr>
                 <w:b/>
                 <w:bCs/>
                 <w:color w:val="FFFFFF"/>
-                <w:sz w:val="18"/>
-                <w:szCs w:val="18"/>
-              </w:rPr>
-              <w:t xml:space="preserve">DOCUMENT</w:t>
-            </w:r>
-          </w:p>
-        </w:tc>
-        <w:tc>
-          <w:tcPr>
-            <w:tcW w:type="dxa" w:w="7257"/>
-            <w:shd w:fill="10263F" w:val="clear"/>
-            <w:tcMar>
-              <w:top w:type="dxa" w:w="100"/>
-              <w:left w:type="dxa" w:w="120"/>
-              <w:bottom w:type="dxa" w:w="100"/>
-              <w:right w:type="dxa" w:w="120"/>
-            </w:tcMar>
-          </w:tcPr>
-          <w:p>
-            <w:r>
-              <w:rPr>
-                <w:b/>
-                <w:bCs/>
-                <w:color w:val="FFFFFF"/>
-                <w:sz w:val="18"/>
-                <w:szCs w:val="18"/>
-              </w:rPr>
-              <w:t xml:space="preserve">Guide utilisateur et de dépannage — Recherche Documentaire Intelligente (RAG)</w:t>
-            </w:r>
-          </w:p>
-        </w:tc>
-      </w:tr>
-      <w:tr>
-        <w:tc>
-          <w:tcPr>
-            <w:tcW w:type="dxa" w:w="2822"/>
-            <w:shd w:fill="FFFFFF" w:val="clear"/>
-            <w:tcMar>
-              <w:top w:type="dxa" w:w="100"/>
-              <w:left w:type="dxa" w:w="120"/>
-              <w:bottom w:type="dxa" w:w="100"/>
-              <w:right w:type="dxa" w:w="120"/>
-            </w:tcMar>
-          </w:tcPr>
-          <w:p>
-            <w:r>
-              <w:rPr>
-                <w:b w:val="false"/>
-                <w:bCs w:val="false"/>
-                <w:color w:val="1F2937"/>
-                <w:sz w:val="19"/>
-                <w:szCs w:val="19"/>
-              </w:rPr>
-              <w:t xml:space="preserve">CAS DE RÉFÉRENCE</w:t>
-            </w:r>
-          </w:p>
-        </w:tc>
-        <w:tc>
-          <w:tcPr>
-            <w:tcW w:type="dxa" w:w="7257"/>
-            <w:shd w:fill="FFFFFF" w:val="clear"/>
-            <w:tcMar>
-              <w:top w:type="dxa" w:w="100"/>
-              <w:left w:type="dxa" w:w="120"/>
-              <w:bottom w:type="dxa" w:w="100"/>
-              <w:right w:type="dxa" w:w="120"/>
-            </w:tcMar>
-          </w:tcPr>
-          <w:p>
-            <w:r>
-              <w:rPr>
-                <w:b w:val="false"/>
-                <w:bCs w:val="false"/>
-                <w:color w:val="1F2937"/>
-                <w:sz w:val="19"/>
-                <w:szCs w:val="19"/>
-              </w:rPr>
-              <w:t xml:space="preserve">TransferAI Africa — système RAG en production depuis juillet 2026</w:t>
-            </w:r>
-          </w:p>
-        </w:tc>
-      </w:tr>
-      <w:tr>
-        <w:tc>
-          <w:tcPr>
-            <w:tcW w:type="dxa" w:w="2822"/>
-            <w:shd w:fill="F4F6F9" w:val="clear"/>
-            <w:tcMar>
-              <w:top w:type="dxa" w:w="100"/>
-              <w:left w:type="dxa" w:w="120"/>
-              <w:bottom w:type="dxa" w:w="100"/>
-              <w:right w:type="dxa" w:w="120"/>
-            </w:tcMar>
-          </w:tcPr>
-          <w:p>
-            <w:r>
-              <w:rPr>
-                <w:b w:val="false"/>
-                <w:bCs w:val="false"/>
-                <w:color w:val="1F2937"/>
-                <w:sz w:val="19"/>
-                <w:szCs w:val="19"/>
-              </w:rPr>
-              <w:t xml:space="preserve">PUBLIC</w:t>
-            </w:r>
-          </w:p>
-        </w:tc>
-        <w:tc>
-          <w:tcPr>
-            <w:tcW w:type="dxa" w:w="7257"/>
-            <w:shd w:fill="F4F6F9" w:val="clear"/>
-            <w:tcMar>
-              <w:top w:type="dxa" w:w="100"/>
-              <w:left w:type="dxa" w:w="120"/>
-              <w:bottom w:type="dxa" w:w="100"/>
-              <w:right w:type="dxa" w:w="120"/>
-            </w:tcMar>
-          </w:tcPr>
-          <w:p>
-            <w:r>
-              <w:rPr>
-                <w:b w:val="false"/>
-                <w:bCs w:val="false"/>
-                <w:color w:val="1F2937"/>
-                <w:sz w:val="19"/>
-                <w:szCs w:val="19"/>
-              </w:rPr>
-              <w:t xml:space="preserve">Toute organisation souhaitant évaluer ou déployer un système RAG</w:t>
+                <w:sz w:val="36"/>
+                <w:szCs w:val="36"/>
+              </w:rPr>
+              <w:t xml:space="preserve">TransferAI Africa</w:t>
+            </w:r>
+          </w:p>
+          <w:p>
+            <w:pPr>
+              <w:jc w:val="center"/>
+            </w:pPr>
+            <w:r>
+              <w:rPr>
+                <w:i/>
+                <w:iCs/>
+                <w:color w:val="E8A020"/>
+                <w:sz w:val="20"/>
+                <w:szCs w:val="20"/>
+              </w:rPr>
+              <w:t xml:space="preserve">Solutions d'Intelligence Artificielle pour l'Afrique</w:t>
             </w:r>
           </w:p>
         </w:tc>
@@ -244,241 +65,64 @@
     </w:tbl>
     <w:p>
       <w:pPr>
-        <w:pStyle w:val="Heading1"/>
-        <w:pBdr>
-          <w:bottom w:val="single" w:color="1E8A99" w:sz="8" w:space="6"/>
-        </w:pBdr>
-        <w:spacing w:after="200" w:before="480"/>
+        <w:spacing w:after="360"/>
+      </w:pPr>
+    </w:p>
+    <w:p>
+      <w:pPr>
+        <w:spacing w:after="60"/>
+        <w:jc w:val="center"/>
       </w:pPr>
       <w:r>
         <w:rPr>
           <w:b/>
           <w:bCs/>
-          <w:color w:val="10263F"/>
+          <w:color w:val="1B3F6E"/>
+          <w:sz w:val="40"/>
+          <w:szCs w:val="40"/>
+        </w:rPr>
+        <w:t xml:space="preserve">GUIDE COMPLET</w:t>
+      </w:r>
+    </w:p>
+    <w:p>
+      <w:pPr>
+        <w:spacing w:after="40"/>
+        <w:jc w:val="center"/>
+      </w:pPr>
+      <w:r>
+        <w:rPr>
+          <w:b/>
+          <w:bCs/>
+          <w:color w:val="E8A020"/>
           <w:sz w:val="30"/>
           <w:szCs w:val="30"/>
         </w:rPr>
-        <w:t xml:space="preserve">Sommaire</w:t>
-      </w:r>
-    </w:p>
-    <w:p>
-      <w:pPr>
-        <w:pStyle w:val="ListParagraph"/>
-        <w:numPr>
-          <w:ilvl w:val="0"/>
-          <w:numId w:val="2"/>
-        </w:numPr>
-        <w:spacing w:after="90"/>
-      </w:pPr>
-      <w:r>
-        <w:rPr>
-          <w:color w:val="1F2937"/>
-          <w:sz w:val="21"/>
-          <w:szCs w:val="21"/>
-        </w:rPr>
-        <w:t xml:space="preserve">Partie 1 — Comprendre le RAG : définition, fonctionnement, vocabulaire</w:t>
-      </w:r>
-    </w:p>
-    <w:p>
-      <w:pPr>
-        <w:pStyle w:val="ListParagraph"/>
-        <w:numPr>
-          <w:ilvl w:val="0"/>
-          <w:numId w:val="2"/>
-        </w:numPr>
-        <w:spacing w:after="90"/>
-      </w:pPr>
-      <w:r>
-        <w:rPr>
-          <w:color w:val="1F2937"/>
-          <w:sz w:val="21"/>
-          <w:szCs w:val="21"/>
-        </w:rPr>
-        <w:t xml:space="preserve">Partie 2 — Le cas d'usage TransferAI Africa : une mise en œuvre concrète</w:t>
-      </w:r>
-    </w:p>
-    <w:p>
-      <w:pPr>
-        <w:pStyle w:val="ListParagraph"/>
-        <w:numPr>
-          <w:ilvl w:val="0"/>
-          <w:numId w:val="2"/>
-        </w:numPr>
-        <w:spacing w:after="90"/>
-      </w:pPr>
-      <w:r>
-        <w:rPr>
-          <w:color w:val="1F2937"/>
-          <w:sz w:val="21"/>
-          <w:szCs w:val="21"/>
-        </w:rPr>
-        <w:t xml:space="preserve">Partie 3 — Avant / Après et retour sur investissement</w:t>
-      </w:r>
-    </w:p>
-    <w:p>
-      <w:pPr>
-        <w:pStyle w:val="ListParagraph"/>
-        <w:numPr>
-          <w:ilvl w:val="0"/>
-          <w:numId w:val="2"/>
-        </w:numPr>
-        <w:spacing w:after="90"/>
-      </w:pPr>
-      <w:r>
-        <w:rPr>
-          <w:color w:val="1F2937"/>
-          <w:sz w:val="21"/>
-          <w:szCs w:val="21"/>
-        </w:rPr>
-        <w:t xml:space="preserve">Partie 4 — Applications par secteur d'activité</w:t>
-      </w:r>
-    </w:p>
-    <w:p>
-      <w:pPr>
-        <w:pStyle w:val="ListParagraph"/>
-        <w:numPr>
-          <w:ilvl w:val="0"/>
-          <w:numId w:val="2"/>
-        </w:numPr>
-        <w:spacing w:after="90"/>
-      </w:pPr>
-      <w:r>
-        <w:rPr>
-          <w:color w:val="1F2937"/>
-          <w:sz w:val="21"/>
-          <w:szCs w:val="21"/>
-        </w:rPr>
-        <w:t xml:space="preserve">Partie 5 — Guide utilisateur : bien utiliser un système RAG au quotidien</w:t>
-      </w:r>
-    </w:p>
-    <w:p>
-      <w:pPr>
-        <w:pStyle w:val="ListParagraph"/>
-        <w:numPr>
-          <w:ilvl w:val="0"/>
-          <w:numId w:val="2"/>
-        </w:numPr>
-        <w:spacing w:after="90"/>
-      </w:pPr>
-      <w:r>
-        <w:rPr>
-          <w:color w:val="1F2937"/>
-          <w:sz w:val="21"/>
-          <w:szCs w:val="21"/>
-        </w:rPr>
-        <w:t xml:space="preserve">Partie 6 — Guide de dépannage</w:t>
-      </w:r>
-    </w:p>
-    <w:p>
-      <w:pPr>
-        <w:pStyle w:val="ListParagraph"/>
-        <w:numPr>
-          <w:ilvl w:val="0"/>
-          <w:numId w:val="2"/>
-        </w:numPr>
-        <w:spacing w:after="90"/>
-      </w:pPr>
-      <w:r>
-        <w:rPr>
-          <w:color w:val="1F2937"/>
-          <w:sz w:val="21"/>
-          <w:szCs w:val="21"/>
-        </w:rPr>
-        <w:t xml:space="preserve">Partie 7 — Conclusion et prochaines étapes</w:t>
-      </w:r>
-    </w:p>
-    <w:p>
-      <w:r>
-        <w:br w:type="page"/>
-      </w:r>
-    </w:p>
-    <w:p>
-      <w:pPr>
-        <w:pStyle w:val="Heading1"/>
-        <w:pBdr>
-          <w:bottom w:val="single" w:color="1E8A99" w:sz="8" w:space="6"/>
-        </w:pBdr>
-        <w:spacing w:after="200" w:before="480"/>
-      </w:pPr>
-      <w:r>
-        <w:rPr>
-          <w:b/>
-          <w:bCs/>
-          <w:color w:val="10263F"/>
-          <w:sz w:val="30"/>
-          <w:szCs w:val="30"/>
-        </w:rPr>
-        <w:t xml:space="preserve">Partie 1 — Comprendre le RAG</w:t>
-      </w:r>
-    </w:p>
-    <w:p>
-      <w:pPr>
-        <w:pStyle w:val="Heading2"/>
-        <w:spacing w:after="140" w:before="320"/>
-      </w:pPr>
-      <w:r>
-        <w:rPr>
-          <w:b/>
-          <w:bCs/>
-          <w:color w:val="10263F"/>
-          <w:sz w:val="23"/>
-          <w:szCs w:val="23"/>
-        </w:rPr>
-        <w:t xml:space="preserve">1.1 Qu'est-ce qu'un RAG ?</w:t>
-      </w:r>
-    </w:p>
-    <w:p>
-      <w:pPr>
-        <w:spacing w:after="160" w:line="300"/>
-      </w:pPr>
-      <w:r>
-        <w:rPr>
-          <w:b w:val="false"/>
-          <w:bCs w:val="false"/>
-          <w:i w:val="false"/>
-          <w:iCs w:val="false"/>
-          <w:color w:val="1F2937"/>
-          <w:sz w:val="21"/>
-          <w:szCs w:val="21"/>
-        </w:rPr>
-        <w:t xml:space="preserve">RAG signifie « Retrieval-Augmented Generation », soit en français « génération augmentée par récupération d'information ». C'est aujourd'hui l'une des architectures d'intelligence artificielle les plus utilisées en entreprise, car elle résout un problème très concret : comment faire en sorte qu'une IA réponde avec des informations exactes, à jour et propres à une organisation, plutôt qu'avec des connaissances génériques ou approximatives issues d'internet.</w:t>
-      </w:r>
-    </w:p>
-    <w:p>
-      <w:pPr>
-        <w:pBdr>
-          <w:left w:val="single" w:color="1E8A99" w:sz="12" w:space="8"/>
-        </w:pBdr>
-        <w:spacing w:after="200" w:before="100"/>
-        <w:ind w:left="260"/>
+        <w:t xml:space="preserve">Recherche Documentaire Intelligente</w:t>
+      </w:r>
+    </w:p>
+    <w:p>
+      <w:pPr>
+        <w:spacing w:after="200"/>
+        <w:jc w:val="center"/>
       </w:pPr>
       <w:r>
         <w:rPr>
           <w:i/>
           <w:iCs/>
-          <w:color w:val="6B7280"/>
-          <w:sz w:val="20"/>
-          <w:szCs w:val="20"/>
-        </w:rPr>
-        <w:t xml:space="preserve">Définition simple : un RAG, c'est comme avoir un expert qui connaît parfaitement toute votre documentation et qui peut répondre instantanément à n'importe quelle question en citant ses sources.</w:t>
-      </w:r>
-    </w:p>
-    <w:p>
-      <w:pPr>
-        <w:spacing w:after="160" w:line="300"/>
-      </w:pPr>
-      <w:r>
-        <w:rPr>
-          <w:b w:val="false"/>
-          <w:bCs w:val="false"/>
-          <w:i w:val="false"/>
-          <w:iCs w:val="false"/>
-          <w:color w:val="1F2937"/>
-          <w:sz w:val="21"/>
-          <w:szCs w:val="21"/>
-        </w:rPr>
-        <w:t xml:space="preserve">Un système RAG combine deux briques complémentaires : la récupération (« Retrieval »), qui consiste à chercher, dans une base documentaire propre à l'organisation, les passages les plus pertinents par rapport à la question posée ; et la génération augmentée (« Augmented Generation »), où un modèle de langage rédige ensuite une réponse en s'appuyant explicitement sur ces passages, au lieu d'inventer une réponse à partir de ses seules connaissances générales.</w:t>
-      </w:r>
+          <w:color w:val="0D7D6B"/>
+          <w:sz w:val="19"/>
+          <w:szCs w:val="19"/>
+        </w:rPr>
+        <w:t xml:space="preserve">Powered by RAG — Retrieval Augmented Generation | Cas d'usage réel et guide réplicable pour toute organisation</w:t>
+      </w:r>
+    </w:p>
+    <w:p>
+      <w:pPr>
+        <w:pBdr>
+          <w:bottom w:val="single" w:color="E8A020" w:sz="10" w:space="1"/>
+        </w:pBdr>
+        <w:spacing w:after="260"/>
+      </w:pPr>
     </w:p>
     <w:tbl>
       <w:tblPr>
@@ -493,15 +137,595 @@
         </w:tblBorders>
       </w:tblPr>
       <w:tblGrid>
-        <w:gridCol w:w="2620"/>
-        <w:gridCol w:w="4032"/>
-        <w:gridCol w:w="3427"/>
+        <w:gridCol w:w="3360"/>
+        <w:gridCol w:w="3360"/>
+        <w:gridCol w:w="3360"/>
       </w:tblGrid>
       <w:tr>
         <w:tc>
           <w:tcPr>
-            <w:tcW w:type="dxa" w:w="2620"/>
-            <w:shd w:fill="10263F" w:val="clear"/>
+            <w:tcW w:type="dxa" w:w="3360"/>
+            <w:shd w:fill="1B3F6E" w:val="clear"/>
+            <w:tcMar>
+              <w:top w:type="dxa" w:w="220"/>
+              <w:left w:type="dxa" w:w="120"/>
+              <w:bottom w:type="dxa" w:w="220"/>
+              <w:right w:type="dxa" w:w="120"/>
+            </w:tcMar>
+          </w:tcPr>
+          <w:p>
+            <w:pPr>
+              <w:spacing w:after="60"/>
+              <w:jc w:val="center"/>
+            </w:pPr>
+            <w:r>
+              <w:rPr>
+                <w:b/>
+                <w:bCs/>
+                <w:color w:val="FFFFFF"/>
+                <w:sz w:val="48"/>
+                <w:szCs w:val="48"/>
+              </w:rPr>
+              <w:t xml:space="preserve">R</w:t>
+            </w:r>
+          </w:p>
+          <w:p>
+            <w:pPr>
+              <w:spacing w:after="40"/>
+              <w:jc w:val="center"/>
+            </w:pPr>
+            <w:r>
+              <w:rPr>
+                <w:b/>
+                <w:bCs/>
+                <w:color w:val="FFFFFF"/>
+                <w:sz w:val="21"/>
+                <w:szCs w:val="21"/>
+              </w:rPr>
+              <w:t xml:space="preserve">Retrieval</w:t>
+            </w:r>
+          </w:p>
+          <w:p>
+            <w:pPr>
+              <w:jc w:val="center"/>
+            </w:pPr>
+            <w:r>
+              <w:rPr>
+                <w:color w:val="FFFFFF"/>
+                <w:sz w:val="15"/>
+                <w:szCs w:val="15"/>
+              </w:rPr>
+              <w:t xml:space="preserve">Recherche dans vos propres documents</w:t>
+            </w:r>
+          </w:p>
+        </w:tc>
+        <w:tc>
+          <w:tcPr>
+            <w:tcW w:type="dxa" w:w="3360"/>
+            <w:shd w:fill="0D7D6B" w:val="clear"/>
+            <w:tcMar>
+              <w:top w:type="dxa" w:w="220"/>
+              <w:left w:type="dxa" w:w="120"/>
+              <w:bottom w:type="dxa" w:w="220"/>
+              <w:right w:type="dxa" w:w="120"/>
+            </w:tcMar>
+          </w:tcPr>
+          <w:p>
+            <w:pPr>
+              <w:spacing w:after="60"/>
+              <w:jc w:val="center"/>
+            </w:pPr>
+            <w:r>
+              <w:rPr>
+                <w:b/>
+                <w:bCs/>
+                <w:color w:val="FFFFFF"/>
+                <w:sz w:val="48"/>
+                <w:szCs w:val="48"/>
+              </w:rPr>
+              <w:t xml:space="preserve">A</w:t>
+            </w:r>
+          </w:p>
+          <w:p>
+            <w:pPr>
+              <w:spacing w:after="40"/>
+              <w:jc w:val="center"/>
+            </w:pPr>
+            <w:r>
+              <w:rPr>
+                <w:b/>
+                <w:bCs/>
+                <w:color w:val="FFFFFF"/>
+                <w:sz w:val="21"/>
+                <w:szCs w:val="21"/>
+              </w:rPr>
+              <w:t xml:space="preserve">Augmented</w:t>
+            </w:r>
+          </w:p>
+          <w:p>
+            <w:pPr>
+              <w:jc w:val="center"/>
+            </w:pPr>
+            <w:r>
+              <w:rPr>
+                <w:color w:val="FFFFFF"/>
+                <w:sz w:val="15"/>
+                <w:szCs w:val="15"/>
+              </w:rPr>
+              <w:t xml:space="preserve">Enrichit avec les extraits pertinents</w:t>
+            </w:r>
+          </w:p>
+        </w:tc>
+        <w:tc>
+          <w:tcPr>
+            <w:tcW w:type="dxa" w:w="3360"/>
+            <w:shd w:fill="E8A020" w:val="clear"/>
+            <w:tcMar>
+              <w:top w:type="dxa" w:w="220"/>
+              <w:left w:type="dxa" w:w="120"/>
+              <w:bottom w:type="dxa" w:w="220"/>
+              <w:right w:type="dxa" w:w="120"/>
+            </w:tcMar>
+          </w:tcPr>
+          <w:p>
+            <w:pPr>
+              <w:spacing w:after="60"/>
+              <w:jc w:val="center"/>
+            </w:pPr>
+            <w:r>
+              <w:rPr>
+                <w:b/>
+                <w:bCs/>
+                <w:color w:val="FFFFFF"/>
+                <w:sz w:val="48"/>
+                <w:szCs w:val="48"/>
+              </w:rPr>
+              <w:t xml:space="preserve">G</w:t>
+            </w:r>
+          </w:p>
+          <w:p>
+            <w:pPr>
+              <w:spacing w:after="40"/>
+              <w:jc w:val="center"/>
+            </w:pPr>
+            <w:r>
+              <w:rPr>
+                <w:b/>
+                <w:bCs/>
+                <w:color w:val="FFFFFF"/>
+                <w:sz w:val="21"/>
+                <w:szCs w:val="21"/>
+              </w:rPr>
+              <w:t xml:space="preserve">Generation</w:t>
+            </w:r>
+          </w:p>
+          <w:p>
+            <w:pPr>
+              <w:jc w:val="center"/>
+            </w:pPr>
+            <w:r>
+              <w:rPr>
+                <w:color w:val="FFFFFF"/>
+                <w:sz w:val="15"/>
+                <w:szCs w:val="15"/>
+              </w:rPr>
+              <w:t xml:space="preserve">Rédige une réponse claire et sourcée</w:t>
+            </w:r>
+          </w:p>
+        </w:tc>
+      </w:tr>
+    </w:tbl>
+    <w:p>
+      <w:pPr>
+        <w:spacing w:after="360"/>
+      </w:pPr>
+    </w:p>
+    <w:p>
+      <w:pPr>
+        <w:pBdr>
+          <w:bottom w:val="single" w:color="E8A020" w:sz="6" w:space="1"/>
+        </w:pBdr>
+        <w:spacing w:after="200"/>
+      </w:pPr>
+    </w:p>
+    <w:p>
+      <w:pPr>
+        <w:spacing w:after="40"/>
+        <w:jc w:val="center"/>
+      </w:pPr>
+      <w:r>
+        <w:rPr>
+          <w:color w:val="6B7280"/>
+          <w:sz w:val="18"/>
+          <w:szCs w:val="18"/>
+        </w:rPr>
+        <w:t xml:space="preserve">Document préparé par</w:t>
+      </w:r>
+    </w:p>
+    <w:p>
+      <w:pPr>
+        <w:spacing w:after="20"/>
+        <w:jc w:val="center"/>
+      </w:pPr>
+      <w:r>
+        <w:rPr>
+          <w:b/>
+          <w:bCs/>
+          <w:color w:val="1B3F6E"/>
+          <w:sz w:val="21"/>
+          <w:szCs w:val="21"/>
+        </w:rPr>
+        <w:t xml:space="preserve">Médard Sery</w:t>
+      </w:r>
+    </w:p>
+    <w:p>
+      <w:pPr>
+        <w:spacing w:after="120"/>
+        <w:jc w:val="center"/>
+      </w:pPr>
+      <w:r>
+        <w:rPr>
+          <w:i/>
+          <w:iCs/>
+          <w:color w:val="6B7280"/>
+          <w:sz w:val="18"/>
+          <w:szCs w:val="18"/>
+        </w:rPr>
+        <w:t xml:space="preserve">Consultant Expert, Data Engineering, Cloud &amp; Plateformes IA</w:t>
+      </w:r>
+    </w:p>
+    <w:p>
+      <w:pPr>
+        <w:spacing w:after="20"/>
+        <w:jc w:val="center"/>
+      </w:pPr>
+      <w:r>
+        <w:rPr>
+          <w:b/>
+          <w:bCs/>
+          <w:color w:val="1B3F6E"/>
+          <w:sz w:val="21"/>
+          <w:szCs w:val="21"/>
+        </w:rPr>
+        <w:t xml:space="preserve">Soulemane Konaté</w:t>
+      </w:r>
+    </w:p>
+    <w:p>
+      <w:pPr>
+        <w:spacing w:after="200"/>
+        <w:jc w:val="center"/>
+      </w:pPr>
+      <w:r>
+        <w:rPr>
+          <w:i/>
+          <w:iCs/>
+          <w:color w:val="6B7280"/>
+          <w:sz w:val="18"/>
+          <w:szCs w:val="18"/>
+        </w:rPr>
+        <w:t xml:space="preserve">Consultant Expert, Enterprise AI Engineering &amp; Data Platforms</w:t>
+      </w:r>
+    </w:p>
+    <w:p>
+      <w:pPr>
+        <w:jc w:val="center"/>
+      </w:pPr>
+      <w:r>
+        <w:rPr>
+          <w:color w:val="0D7D6B"/>
+          <w:sz w:val="18"/>
+          <w:szCs w:val="18"/>
+        </w:rPr>
+        <w:t xml:space="preserve">contact@transferai.ci  |  www.transferai.ci</w:t>
+      </w:r>
+    </w:p>
+    <w:p>
+      <w:r>
+        <w:br w:type="page"/>
+      </w:r>
+    </w:p>
+    <w:p>
+      <w:pPr>
+        <w:pStyle w:val="Heading1"/>
+        <w:pBdr>
+          <w:bottom w:val="single" w:color="E8A020" w:sz="8" w:space="6"/>
+        </w:pBdr>
+        <w:spacing w:after="200" w:before="480"/>
+      </w:pPr>
+      <w:r>
+        <w:rPr>
+          <w:b/>
+          <w:bCs/>
+          <w:color w:val="1B3F6E"/>
+          <w:sz w:val="30"/>
+          <w:szCs w:val="30"/>
+        </w:rPr>
+        <w:t xml:space="preserve">Sommaire</w:t>
+      </w:r>
+    </w:p>
+    <w:p>
+      <w:pPr>
+        <w:pStyle w:val="ListParagraph"/>
+        <w:numPr>
+          <w:ilvl w:val="0"/>
+          <w:numId w:val="2"/>
+        </w:numPr>
+        <w:spacing w:after="90"/>
+      </w:pPr>
+      <w:r>
+        <w:rPr>
+          <w:color w:val="1F2937"/>
+          <w:sz w:val="21"/>
+          <w:szCs w:val="21"/>
+        </w:rPr>
+        <w:t xml:space="preserve">Partie 1 — Comprendre le RAG : définition, fonctionnement, vocabulaire</w:t>
+      </w:r>
+    </w:p>
+    <w:p>
+      <w:pPr>
+        <w:pStyle w:val="ListParagraph"/>
+        <w:numPr>
+          <w:ilvl w:val="0"/>
+          <w:numId w:val="2"/>
+        </w:numPr>
+        <w:spacing w:after="90"/>
+      </w:pPr>
+      <w:r>
+        <w:rPr>
+          <w:color w:val="1F2937"/>
+          <w:sz w:val="21"/>
+          <w:szCs w:val="21"/>
+        </w:rPr>
+        <w:t xml:space="preserve">Partie 2 — Le cas d'usage TransferAI Africa : une mise en œuvre concrète</w:t>
+      </w:r>
+    </w:p>
+    <w:p>
+      <w:pPr>
+        <w:pStyle w:val="ListParagraph"/>
+        <w:numPr>
+          <w:ilvl w:val="0"/>
+          <w:numId w:val="2"/>
+        </w:numPr>
+        <w:spacing w:after="90"/>
+      </w:pPr>
+      <w:r>
+        <w:rPr>
+          <w:color w:val="1F2937"/>
+          <w:sz w:val="21"/>
+          <w:szCs w:val="21"/>
+        </w:rPr>
+        <w:t xml:space="preserve">Partie 3 — Avant / Après et retour sur investissement</w:t>
+      </w:r>
+    </w:p>
+    <w:p>
+      <w:pPr>
+        <w:pStyle w:val="ListParagraph"/>
+        <w:numPr>
+          <w:ilvl w:val="0"/>
+          <w:numId w:val="2"/>
+        </w:numPr>
+        <w:spacing w:after="90"/>
+      </w:pPr>
+      <w:r>
+        <w:rPr>
+          <w:color w:val="1F2937"/>
+          <w:sz w:val="21"/>
+          <w:szCs w:val="21"/>
+        </w:rPr>
+        <w:t xml:space="preserve">Partie 4 — Applications par secteur d'activité</w:t>
+      </w:r>
+    </w:p>
+    <w:p>
+      <w:pPr>
+        <w:pStyle w:val="ListParagraph"/>
+        <w:numPr>
+          <w:ilvl w:val="0"/>
+          <w:numId w:val="2"/>
+        </w:numPr>
+        <w:spacing w:after="90"/>
+      </w:pPr>
+      <w:r>
+        <w:rPr>
+          <w:color w:val="1F2937"/>
+          <w:sz w:val="21"/>
+          <w:szCs w:val="21"/>
+        </w:rPr>
+        <w:t xml:space="preserve">Partie 5 — Guide utilisateur : bien utiliser un système RAG au quotidien</w:t>
+      </w:r>
+    </w:p>
+    <w:p>
+      <w:pPr>
+        <w:pStyle w:val="ListParagraph"/>
+        <w:numPr>
+          <w:ilvl w:val="0"/>
+          <w:numId w:val="2"/>
+        </w:numPr>
+        <w:spacing w:after="90"/>
+      </w:pPr>
+      <w:r>
+        <w:rPr>
+          <w:color w:val="1F2937"/>
+          <w:sz w:val="21"/>
+          <w:szCs w:val="21"/>
+        </w:rPr>
+        <w:t xml:space="preserve">Partie 6 — Guide de dépannage</w:t>
+      </w:r>
+    </w:p>
+    <w:p>
+      <w:pPr>
+        <w:pStyle w:val="ListParagraph"/>
+        <w:numPr>
+          <w:ilvl w:val="0"/>
+          <w:numId w:val="2"/>
+        </w:numPr>
+        <w:spacing w:after="90"/>
+      </w:pPr>
+      <w:r>
+        <w:rPr>
+          <w:color w:val="1F2937"/>
+          <w:sz w:val="21"/>
+          <w:szCs w:val="21"/>
+        </w:rPr>
+        <w:t xml:space="preserve">Partie 7 — Conclusion et prochaines étapes</w:t>
+      </w:r>
+    </w:p>
+    <w:p>
+      <w:r>
+        <w:br w:type="page"/>
+      </w:r>
+    </w:p>
+    <w:p>
+      <w:pPr>
+        <w:pStyle w:val="Heading1"/>
+        <w:pBdr>
+          <w:bottom w:val="single" w:color="E8A020" w:sz="8" w:space="6"/>
+        </w:pBdr>
+        <w:spacing w:after="200" w:before="480"/>
+      </w:pPr>
+      <w:r>
+        <w:rPr>
+          <w:b/>
+          <w:bCs/>
+          <w:color w:val="1B3F6E"/>
+          <w:sz w:val="30"/>
+          <w:szCs w:val="30"/>
+        </w:rPr>
+        <w:t xml:space="preserve">Partie 1 — Comprendre le RAG</w:t>
+      </w:r>
+    </w:p>
+    <w:p>
+      <w:pPr>
+        <w:pStyle w:val="Heading2"/>
+        <w:spacing w:after="140" w:before="320"/>
+      </w:pPr>
+      <w:r>
+        <w:rPr>
+          <w:b/>
+          <w:bCs/>
+          <w:color w:val="1B3F6E"/>
+          <w:sz w:val="23"/>
+          <w:szCs w:val="23"/>
+        </w:rPr>
+        <w:t xml:space="preserve">1.1 Qu'est-ce qu'un RAG ?</w:t>
+      </w:r>
+    </w:p>
+    <w:p>
+      <w:pPr>
+        <w:spacing w:after="160" w:line="300"/>
+      </w:pPr>
+      <w:r>
+        <w:rPr>
+          <w:b w:val="false"/>
+          <w:bCs w:val="false"/>
+          <w:i w:val="false"/>
+          <w:iCs w:val="false"/>
+          <w:color w:val="1F2937"/>
+          <w:sz w:val="21"/>
+          <w:szCs w:val="21"/>
+        </w:rPr>
+        <w:t xml:space="preserve">RAG signifie « Retrieval-Augmented Generation », soit en français « génération augmentée par récupération d'information ». C'est aujourd'hui l'une des architectures d'intelligence artificielle les plus utilisées en entreprise, car elle résout un problème très concret : comment faire en sorte qu'une IA réponde avec des informations exactes, à jour et propres à une organisation, plutôt qu'avec des connaissances génériques ou approximatives issues d'internet.</w:t>
+      </w:r>
+    </w:p>
+    <w:tbl>
+      <w:tblPr>
+        <w:tblW w:type="dxa" w:w="10080"/>
+        <w:tblBorders>
+          <w:top w:val="single" w:color="auto" w:sz="4"/>
+          <w:left w:val="single" w:color="auto" w:sz="4"/>
+          <w:bottom w:val="single" w:color="auto" w:sz="4"/>
+          <w:right w:val="single" w:color="auto" w:sz="4"/>
+          <w:insideH w:val="single" w:color="auto" w:sz="4"/>
+          <w:insideV w:val="single" w:color="auto" w:sz="4"/>
+        </w:tblBorders>
+      </w:tblPr>
+      <w:tblGrid>
+        <w:gridCol w:w="10080"/>
+      </w:tblGrid>
+      <w:tr>
+        <w:tc>
+          <w:tcPr>
+            <w:tcW w:type="dxa" w:w="10080"/>
+            <w:shd w:fill="D6E4F0" w:val="clear"/>
+            <w:tcMar>
+              <w:top w:type="dxa" w:w="160"/>
+              <w:left w:type="dxa" w:w="200"/>
+              <w:bottom w:type="dxa" w:w="160"/>
+              <w:right w:type="dxa" w:w="200"/>
+            </w:tcMar>
+          </w:tcPr>
+          <w:p>
+            <w:pPr>
+              <w:spacing w:after="80"/>
+            </w:pPr>
+            <w:r>
+              <w:rPr>
+                <w:b/>
+                <w:bCs/>
+                <w:color w:val="1B3F6E"/>
+                <w:sz w:val="20"/>
+                <w:szCs w:val="20"/>
+              </w:rPr>
+              <w:t xml:space="preserve">Définition simple</w:t>
+            </w:r>
+          </w:p>
+          <w:p>
+            <w:r>
+              <w:rPr>
+                <w:color w:val="1F2937"/>
+                <w:sz w:val="20"/>
+                <w:szCs w:val="20"/>
+              </w:rPr>
+              <w:t xml:space="preserve">Le RAG, c'est comme avoir un expert qui connaît parfaitement toute votre documentation et qui peut répondre instantanément à n'importe quelle question en citant ses sources.</w:t>
+            </w:r>
+          </w:p>
+        </w:tc>
+      </w:tr>
+    </w:tbl>
+    <w:p>
+      <w:pPr>
+        <w:spacing w:after="120"/>
+      </w:pPr>
+    </w:p>
+    <w:p>
+      <w:pPr>
+        <w:spacing w:after="160" w:line="300"/>
+      </w:pPr>
+      <w:r>
+        <w:rPr>
+          <w:b w:val="false"/>
+          <w:bCs w:val="false"/>
+          <w:i w:val="false"/>
+          <w:iCs w:val="false"/>
+          <w:color w:val="1F2937"/>
+          <w:sz w:val="21"/>
+          <w:szCs w:val="21"/>
+        </w:rPr>
+        <w:t xml:space="preserve">Un système RAG combine deux briques complémentaires : la récupération (« Retrieval »), qui consiste à chercher, dans une base documentaire propre à l'organisation, les passages les plus pertinents par rapport à la question posée ; et la génération augmentée (« Augmented Generation »), où un modèle de langage rédige ensuite une réponse en s'appuyant explicitement sur ces passages, au lieu d'inventer une réponse à partir de ses seules connaissances générales.</w:t>
+      </w:r>
+    </w:p>
+    <w:tbl>
+      <w:tblPr>
+        <w:tblW w:type="dxa" w:w="10080"/>
+        <w:tblBorders>
+          <w:top w:val="single" w:color="auto" w:sz="4"/>
+          <w:left w:val="single" w:color="auto" w:sz="4"/>
+          <w:bottom w:val="single" w:color="auto" w:sz="4"/>
+          <w:right w:val="single" w:color="auto" w:sz="4"/>
+          <w:insideH w:val="single" w:color="auto" w:sz="4"/>
+          <w:insideV w:val="single" w:color="auto" w:sz="4"/>
+        </w:tblBorders>
+      </w:tblPr>
+      <w:tblGrid>
+        <w:gridCol w:w="806"/>
+        <w:gridCol w:w="2217"/>
+        <w:gridCol w:w="3830"/>
+        <w:gridCol w:w="3225"/>
+      </w:tblGrid>
+      <w:tr>
+        <w:tc>
+          <w:tcPr>
+            <w:tcW w:type="dxa" w:w="806"/>
+            <w:shd w:fill="1B3F6E" w:val="clear"/>
             <w:tcMar>
               <w:top w:type="dxa" w:w="100"/>
               <w:left w:type="dxa" w:w="120"/>
@@ -518,14 +742,14 @@
                 <w:sz w:val="18"/>
                 <w:szCs w:val="18"/>
               </w:rPr>
-              <w:t xml:space="preserve">LETTRE</w:t>
-            </w:r>
-          </w:p>
-        </w:tc>
-        <w:tc>
-          <w:tcPr>
-            <w:tcW w:type="dxa" w:w="4032"/>
-            <w:shd w:fill="10263F" w:val="clear"/>
+              <w:t xml:space="preserve">Lettre</w:t>
+            </w:r>
+          </w:p>
+        </w:tc>
+        <w:tc>
+          <w:tcPr>
+            <w:tcW w:type="dxa" w:w="2217"/>
+            <w:shd w:fill="1B3F6E" w:val="clear"/>
             <w:tcMar>
               <w:top w:type="dxa" w:w="100"/>
               <w:left w:type="dxa" w:w="120"/>
@@ -542,14 +766,14 @@
                 <w:sz w:val="18"/>
                 <w:szCs w:val="18"/>
               </w:rPr>
-              <w:t xml:space="preserve">CE QUE FAIT L'IA</w:t>
-            </w:r>
-          </w:p>
-        </w:tc>
-        <w:tc>
-          <w:tcPr>
-            <w:tcW w:type="dxa" w:w="3427"/>
-            <w:shd w:fill="10263F" w:val="clear"/>
+              <w:t xml:space="preserve">Mot</w:t>
+            </w:r>
+          </w:p>
+        </w:tc>
+        <w:tc>
+          <w:tcPr>
+            <w:tcW w:type="dxa" w:w="3830"/>
+            <w:shd w:fill="1B3F6E" w:val="clear"/>
             <w:tcMar>
               <w:top w:type="dxa" w:w="100"/>
               <w:left w:type="dxa" w:w="120"/>
@@ -566,7 +790,31 @@
                 <w:sz w:val="18"/>
                 <w:szCs w:val="18"/>
               </w:rPr>
-              <w:t xml:space="preserve">VALEUR POUR L'ORGANISATION</w:t>
+              <w:t xml:space="preserve">Ce que fait l'IA</w:t>
+            </w:r>
+          </w:p>
+        </w:tc>
+        <w:tc>
+          <w:tcPr>
+            <w:tcW w:type="dxa" w:w="3225"/>
+            <w:shd w:fill="1B3F6E" w:val="clear"/>
+            <w:tcMar>
+              <w:top w:type="dxa" w:w="100"/>
+              <w:left w:type="dxa" w:w="120"/>
+              <w:bottom w:type="dxa" w:w="100"/>
+              <w:right w:type="dxa" w:w="120"/>
+            </w:tcMar>
+          </w:tcPr>
+          <w:p>
+            <w:r>
+              <w:rPr>
+                <w:b/>
+                <w:bCs/>
+                <w:color w:val="FFFFFF"/>
+                <w:sz w:val="18"/>
+                <w:szCs w:val="18"/>
+              </w:rPr>
+              <w:t xml:space="preserve">Valeur pour vous</w:t>
             </w:r>
           </w:p>
         </w:tc>
@@ -574,7 +822,34 @@
       <w:tr>
         <w:tc>
           <w:tcPr>
-            <w:tcW w:type="dxa" w:w="2620"/>
+            <w:tcW w:type="dxa" w:w="806"/>
+            <w:shd w:fill="1B3F6E" w:val="clear"/>
+            <w:tcMar>
+              <w:top w:type="dxa" w:w="100"/>
+              <w:left w:type="dxa" w:w="120"/>
+              <w:bottom w:type="dxa" w:w="100"/>
+              <w:right w:type="dxa" w:w="120"/>
+            </w:tcMar>
+          </w:tcPr>
+          <w:p>
+            <w:pPr>
+              <w:jc w:val="center"/>
+            </w:pPr>
+            <w:r>
+              <w:rPr>
+                <w:b/>
+                <w:bCs/>
+                <w:color w:val="FFFFFF"/>
+                <w:sz w:val="26"/>
+                <w:szCs w:val="26"/>
+              </w:rPr>
+              <w:t xml:space="preserve">R</w:t>
+            </w:r>
+          </w:p>
+        </w:tc>
+        <w:tc>
+          <w:tcPr>
+            <w:tcW w:type="dxa" w:w="2217"/>
             <w:shd w:fill="FFFFFF" w:val="clear"/>
             <w:tcMar>
               <w:top w:type="dxa" w:w="100"/>
@@ -592,13 +867,13 @@
                 <w:sz w:val="19"/>
                 <w:szCs w:val="19"/>
               </w:rPr>
-              <w:t xml:space="preserve">R — Retrieval (recherche)</w:t>
-            </w:r>
-          </w:p>
-        </w:tc>
-        <w:tc>
-          <w:tcPr>
-            <w:tcW w:type="dxa" w:w="4032"/>
+              <w:t xml:space="preserve">Retrieval — Recherche</w:t>
+            </w:r>
+          </w:p>
+        </w:tc>
+        <w:tc>
+          <w:tcPr>
+            <w:tcW w:type="dxa" w:w="3830"/>
             <w:shd w:fill="FFFFFF" w:val="clear"/>
             <w:tcMar>
               <w:top w:type="dxa" w:w="100"/>
@@ -622,7 +897,7 @@
         </w:tc>
         <w:tc>
           <w:tcPr>
-            <w:tcW w:type="dxa" w:w="3427"/>
+            <w:tcW w:type="dxa" w:w="3225"/>
             <w:shd w:fill="FFFFFF" w:val="clear"/>
             <w:tcMar>
               <w:top w:type="dxa" w:w="100"/>
@@ -648,32 +923,59 @@
       <w:tr>
         <w:tc>
           <w:tcPr>
-            <w:tcW w:type="dxa" w:w="2620"/>
-            <w:shd w:fill="F4F6F9" w:val="clear"/>
-            <w:tcMar>
-              <w:top w:type="dxa" w:w="100"/>
-              <w:left w:type="dxa" w:w="120"/>
-              <w:bottom w:type="dxa" w:w="100"/>
-              <w:right w:type="dxa" w:w="120"/>
-            </w:tcMar>
-          </w:tcPr>
-          <w:p>
-            <w:r>
-              <w:rPr>
-                <w:b w:val="false"/>
-                <w:bCs w:val="false"/>
-                <w:color w:val="1F2937"/>
-                <w:sz w:val="19"/>
-                <w:szCs w:val="19"/>
-              </w:rPr>
-              <w:t xml:space="preserve">A — Augmented (augmentée)</w:t>
-            </w:r>
-          </w:p>
-        </w:tc>
-        <w:tc>
-          <w:tcPr>
-            <w:tcW w:type="dxa" w:w="4032"/>
-            <w:shd w:fill="F4F6F9" w:val="clear"/>
+            <w:tcW w:type="dxa" w:w="806"/>
+            <w:shd w:fill="0D7D6B" w:val="clear"/>
+            <w:tcMar>
+              <w:top w:type="dxa" w:w="100"/>
+              <w:left w:type="dxa" w:w="120"/>
+              <w:bottom w:type="dxa" w:w="100"/>
+              <w:right w:type="dxa" w:w="120"/>
+            </w:tcMar>
+          </w:tcPr>
+          <w:p>
+            <w:pPr>
+              <w:jc w:val="center"/>
+            </w:pPr>
+            <w:r>
+              <w:rPr>
+                <w:b/>
+                <w:bCs/>
+                <w:color w:val="FFFFFF"/>
+                <w:sz w:val="26"/>
+                <w:szCs w:val="26"/>
+              </w:rPr>
+              <w:t xml:space="preserve">A</w:t>
+            </w:r>
+          </w:p>
+        </w:tc>
+        <w:tc>
+          <w:tcPr>
+            <w:tcW w:type="dxa" w:w="2217"/>
+            <w:shd w:fill="F4F4F4" w:val="clear"/>
+            <w:tcMar>
+              <w:top w:type="dxa" w:w="100"/>
+              <w:left w:type="dxa" w:w="120"/>
+              <w:bottom w:type="dxa" w:w="100"/>
+              <w:right w:type="dxa" w:w="120"/>
+            </w:tcMar>
+          </w:tcPr>
+          <w:p>
+            <w:r>
+              <w:rPr>
+                <w:b w:val="false"/>
+                <w:bCs w:val="false"/>
+                <w:color w:val="1F2937"/>
+                <w:sz w:val="19"/>
+                <w:szCs w:val="19"/>
+              </w:rPr>
+              <w:t xml:space="preserve">Augmented — Augmentée</w:t>
+            </w:r>
+          </w:p>
+        </w:tc>
+        <w:tc>
+          <w:tcPr>
+            <w:tcW w:type="dxa" w:w="3830"/>
+            <w:shd w:fill="F4F4F4" w:val="clear"/>
             <w:tcMar>
               <w:top w:type="dxa" w:w="100"/>
               <w:left w:type="dxa" w:w="120"/>
@@ -696,8 +998,8 @@
         </w:tc>
         <w:tc>
           <w:tcPr>
-            <w:tcW w:type="dxa" w:w="3427"/>
-            <w:shd w:fill="F4F6F9" w:val="clear"/>
+            <w:tcW w:type="dxa" w:w="3225"/>
+            <w:shd w:fill="F4F4F4" w:val="clear"/>
             <w:tcMar>
               <w:top w:type="dxa" w:w="100"/>
               <w:left w:type="dxa" w:w="120"/>
@@ -722,7 +1024,34 @@
       <w:tr>
         <w:tc>
           <w:tcPr>
-            <w:tcW w:type="dxa" w:w="2620"/>
+            <w:tcW w:type="dxa" w:w="806"/>
+            <w:shd w:fill="E8A020" w:val="clear"/>
+            <w:tcMar>
+              <w:top w:type="dxa" w:w="100"/>
+              <w:left w:type="dxa" w:w="120"/>
+              <w:bottom w:type="dxa" w:w="100"/>
+              <w:right w:type="dxa" w:w="120"/>
+            </w:tcMar>
+          </w:tcPr>
+          <w:p>
+            <w:pPr>
+              <w:jc w:val="center"/>
+            </w:pPr>
+            <w:r>
+              <w:rPr>
+                <w:b/>
+                <w:bCs/>
+                <w:color w:val="FFFFFF"/>
+                <w:sz w:val="26"/>
+                <w:szCs w:val="26"/>
+              </w:rPr>
+              <w:t xml:space="preserve">G</w:t>
+            </w:r>
+          </w:p>
+        </w:tc>
+        <w:tc>
+          <w:tcPr>
+            <w:tcW w:type="dxa" w:w="2217"/>
             <w:shd w:fill="FFFFFF" w:val="clear"/>
             <w:tcMar>
               <w:top w:type="dxa" w:w="100"/>
@@ -740,13 +1069,13 @@
                 <w:sz w:val="19"/>
                 <w:szCs w:val="19"/>
               </w:rPr>
-              <w:t xml:space="preserve">G — Generation (génération)</w:t>
-            </w:r>
-          </w:p>
-        </w:tc>
-        <w:tc>
-          <w:tcPr>
-            <w:tcW w:type="dxa" w:w="4032"/>
+              <w:t xml:space="preserve">Generation — Génération</w:t>
+            </w:r>
+          </w:p>
+        </w:tc>
+        <w:tc>
+          <w:tcPr>
+            <w:tcW w:type="dxa" w:w="3830"/>
             <w:shd w:fill="FFFFFF" w:val="clear"/>
             <w:tcMar>
               <w:top w:type="dxa" w:w="100"/>
@@ -770,7 +1099,7 @@
         </w:tc>
         <w:tc>
           <w:tcPr>
-            <w:tcW w:type="dxa" w:w="3427"/>
+            <w:tcW w:type="dxa" w:w="3225"/>
             <w:shd w:fill="FFFFFF" w:val="clear"/>
             <w:tcMar>
               <w:top w:type="dxa" w:w="100"/>
@@ -796,6 +1125,11 @@
     </w:tbl>
     <w:p>
       <w:pPr>
+        <w:spacing w:after="200"/>
+      </w:pPr>
+    </w:p>
+    <w:p>
+      <w:pPr>
         <w:pStyle w:val="Heading2"/>
         <w:spacing w:after="140" w:before="320"/>
       </w:pPr>
@@ -803,7 +1137,7 @@
         <w:rPr>
           <w:b/>
           <w:bCs/>
-          <w:color w:val="10263F"/>
+          <w:color w:val="1B3F6E"/>
           <w:sz w:val="23"/>
           <w:szCs w:val="23"/>
         </w:rPr>
@@ -824,80 +1158,364 @@
           <w:sz w:val="21"/>
           <w:szCs w:val="21"/>
         </w:rPr>
-        <w:t xml:space="preserve">Le fonctionnement d'un système RAG suit toujours les mêmes quatre grandes étapes, quel que soit le secteur d'activité ou les outils techniques choisis pour le construire :</w:t>
-      </w:r>
-    </w:p>
-    <w:p>
-      <w:pPr>
-        <w:pStyle w:val="ListParagraph"/>
-        <w:numPr>
-          <w:ilvl w:val="0"/>
-          <w:numId w:val="3"/>
-        </w:numPr>
-        <w:spacing w:after="90"/>
-      </w:pPr>
-      <w:r>
-        <w:rPr>
-          <w:color w:val="1F2937"/>
-          <w:sz w:val="21"/>
-          <w:szCs w:val="21"/>
-        </w:rPr>
-        <w:t xml:space="preserve">Ingestion — les documents de référence (procédures, guides, catalogues, argumentaires, réglementations…) sont découpés en petits morceaux de texte (des « chunks »).</w:t>
-      </w:r>
-    </w:p>
-    <w:p>
-      <w:pPr>
-        <w:pStyle w:val="ListParagraph"/>
-        <w:numPr>
-          <w:ilvl w:val="0"/>
-          <w:numId w:val="3"/>
-        </w:numPr>
-        <w:spacing w:after="90"/>
-      </w:pPr>
-      <w:r>
-        <w:rPr>
-          <w:color w:val="1F2937"/>
-          <w:sz w:val="21"/>
-          <w:szCs w:val="21"/>
-        </w:rPr>
-        <w:t xml:space="preserve">Vectorisation (embeddings) — chaque morceau de texte est transformé en une suite de nombres (un « vecteur ») qui représente son sens. Deux textes proches en signification auront des vecteurs proches, même s'ils n'utilisent pas les mêmes mots.</w:t>
-      </w:r>
-    </w:p>
-    <w:p>
-      <w:pPr>
-        <w:pStyle w:val="ListParagraph"/>
-        <w:numPr>
-          <w:ilvl w:val="0"/>
-          <w:numId w:val="3"/>
-        </w:numPr>
-        <w:spacing w:after="90"/>
-      </w:pPr>
-      <w:r>
-        <w:rPr>
-          <w:color w:val="1F2937"/>
-          <w:sz w:val="21"/>
-          <w:szCs w:val="21"/>
-        </w:rPr>
-        <w:t xml:space="preserve">Recherche par similarité — quand une question arrive, elle est elle aussi transformée en vecteur, puis comparée mathématiquement à tous les vecteurs déjà stockés pour retrouver les morceaux de texte les plus proches en signification.</w:t>
-      </w:r>
-    </w:p>
-    <w:p>
-      <w:pPr>
-        <w:pStyle w:val="ListParagraph"/>
-        <w:numPr>
-          <w:ilvl w:val="0"/>
-          <w:numId w:val="3"/>
-        </w:numPr>
-        <w:spacing w:after="90"/>
-      </w:pPr>
-      <w:r>
-        <w:rPr>
-          <w:color w:val="1F2937"/>
-          <w:sz w:val="21"/>
-          <w:szCs w:val="21"/>
-        </w:rPr>
-        <w:t xml:space="preserve">Génération de la réponse — les morceaux retrouvés sont transmis à un modèle de langage, qui rédige une réponse claire en s'appuyant sur ces sources, plutôt que sur sa seule mémoire générale.</w:t>
-      </w:r>
+        <w:t xml:space="preserve">Le fonctionnement d'un système RAG suit toujours les mêmes grandes étapes, quel que soit le secteur d'activité ou les outils techniques choisis pour le construire :</w:t>
+      </w:r>
+    </w:p>
+    <w:tbl>
+      <w:tblPr>
+        <w:tblW w:type="dxa" w:w="10080"/>
+        <w:tblBorders>
+          <w:top w:val="single" w:color="auto" w:sz="4"/>
+          <w:left w:val="single" w:color="auto" w:sz="4"/>
+          <w:bottom w:val="single" w:color="auto" w:sz="4"/>
+          <w:right w:val="single" w:color="auto" w:sz="4"/>
+          <w:insideH w:val="single" w:color="auto" w:sz="4"/>
+          <w:insideV w:val="single" w:color="auto" w:sz="4"/>
+        </w:tblBorders>
+      </w:tblPr>
+      <w:tblGrid>
+        <w:gridCol w:w="907"/>
+        <w:gridCol w:w="9172"/>
+      </w:tblGrid>
+      <w:tr>
+        <w:tc>
+          <w:tcPr>
+            <w:tcW w:type="dxa" w:w="907"/>
+            <w:shd w:fill="1B3F6E" w:val="clear"/>
+            <w:tcMar>
+              <w:top w:type="dxa" w:w="140"/>
+              <w:left w:type="dxa" w:w="100"/>
+              <w:bottom w:type="dxa" w:w="140"/>
+              <w:right w:type="dxa" w:w="100"/>
+            </w:tcMar>
+            <w:vAlign w:val="center"/>
+          </w:tcPr>
+          <w:p>
+            <w:pPr>
+              <w:jc w:val="center"/>
+            </w:pPr>
+            <w:r>
+              <w:rPr>
+                <w:b/>
+                <w:bCs/>
+                <w:color w:val="FFFFFF"/>
+                <w:sz w:val="30"/>
+                <w:szCs w:val="30"/>
+              </w:rPr>
+              <w:t xml:space="preserve">1</w:t>
+            </w:r>
+          </w:p>
+        </w:tc>
+        <w:tc>
+          <w:tcPr>
+            <w:tcW w:type="dxa" w:w="9172"/>
+            <w:shd w:fill="D6E4F0" w:val="clear"/>
+            <w:tcMar>
+              <w:top w:type="dxa" w:w="140"/>
+              <w:left w:type="dxa" w:w="200"/>
+              <w:bottom w:type="dxa" w:w="140"/>
+              <w:right w:type="dxa" w:w="200"/>
+            </w:tcMar>
+          </w:tcPr>
+          <w:p>
+            <w:pPr>
+              <w:spacing w:after="40"/>
+            </w:pPr>
+            <w:r>
+              <w:rPr>
+                <w:b/>
+                <w:bCs/>
+                <w:color w:val="1B3F6E"/>
+                <w:sz w:val="21"/>
+                <w:szCs w:val="21"/>
+              </w:rPr>
+              <w:t xml:space="preserve">Ingestion</w:t>
+            </w:r>
+          </w:p>
+          <w:p>
+            <w:r>
+              <w:rPr>
+                <w:color w:val="1F2937"/>
+                <w:sz w:val="19"/>
+                <w:szCs w:val="19"/>
+              </w:rPr>
+              <w:t xml:space="preserve">Les documents de référence (procédures, guides, catalogues, argumentaires, réglementations…) sont découpés en petits morceaux de texte (des « chunks »).</w:t>
+            </w:r>
+          </w:p>
+        </w:tc>
+      </w:tr>
+    </w:tbl>
+    <w:p>
+      <w:pPr>
+        <w:spacing w:after="80"/>
+      </w:pPr>
+    </w:p>
+    <w:tbl>
+      <w:tblPr>
+        <w:tblW w:type="dxa" w:w="10080"/>
+        <w:tblBorders>
+          <w:top w:val="single" w:color="auto" w:sz="4"/>
+          <w:left w:val="single" w:color="auto" w:sz="4"/>
+          <w:bottom w:val="single" w:color="auto" w:sz="4"/>
+          <w:right w:val="single" w:color="auto" w:sz="4"/>
+          <w:insideH w:val="single" w:color="auto" w:sz="4"/>
+          <w:insideV w:val="single" w:color="auto" w:sz="4"/>
+        </w:tblBorders>
+      </w:tblPr>
+      <w:tblGrid>
+        <w:gridCol w:w="907"/>
+        <w:gridCol w:w="9172"/>
+      </w:tblGrid>
+      <w:tr>
+        <w:tc>
+          <w:tcPr>
+            <w:tcW w:type="dxa" w:w="907"/>
+            <w:shd w:fill="0D7D6B" w:val="clear"/>
+            <w:tcMar>
+              <w:top w:type="dxa" w:w="140"/>
+              <w:left w:type="dxa" w:w="100"/>
+              <w:bottom w:type="dxa" w:w="140"/>
+              <w:right w:type="dxa" w:w="100"/>
+            </w:tcMar>
+            <w:vAlign w:val="center"/>
+          </w:tcPr>
+          <w:p>
+            <w:pPr>
+              <w:jc w:val="center"/>
+            </w:pPr>
+            <w:r>
+              <w:rPr>
+                <w:b/>
+                <w:bCs/>
+                <w:color w:val="FFFFFF"/>
+                <w:sz w:val="30"/>
+                <w:szCs w:val="30"/>
+              </w:rPr>
+              <w:t xml:space="preserve">2</w:t>
+            </w:r>
+          </w:p>
+        </w:tc>
+        <w:tc>
+          <w:tcPr>
+            <w:tcW w:type="dxa" w:w="9172"/>
+            <w:shd w:fill="D6E4F0" w:val="clear"/>
+            <w:tcMar>
+              <w:top w:type="dxa" w:w="140"/>
+              <w:left w:type="dxa" w:w="200"/>
+              <w:bottom w:type="dxa" w:w="140"/>
+              <w:right w:type="dxa" w:w="200"/>
+            </w:tcMar>
+          </w:tcPr>
+          <w:p>
+            <w:pPr>
+              <w:spacing w:after="40"/>
+            </w:pPr>
+            <w:r>
+              <w:rPr>
+                <w:b/>
+                <w:bCs/>
+                <w:color w:val="1B3F6E"/>
+                <w:sz w:val="21"/>
+                <w:szCs w:val="21"/>
+              </w:rPr>
+              <w:t xml:space="preserve">Vectorisation (embeddings)</w:t>
+            </w:r>
+          </w:p>
+          <w:p>
+            <w:r>
+              <w:rPr>
+                <w:color w:val="1F2937"/>
+                <w:sz w:val="19"/>
+                <w:szCs w:val="19"/>
+              </w:rPr>
+              <w:t xml:space="preserve">Chaque morceau de texte est transformé en une suite de nombres (un « vecteur ») qui représente son sens. Deux textes proches en signification auront des vecteurs proches, même s'ils n'utilisent pas les mêmes mots.</w:t>
+            </w:r>
+          </w:p>
+        </w:tc>
+      </w:tr>
+    </w:tbl>
+    <w:p>
+      <w:pPr>
+        <w:spacing w:after="80"/>
+      </w:pPr>
+    </w:p>
+    <w:tbl>
+      <w:tblPr>
+        <w:tblW w:type="dxa" w:w="10080"/>
+        <w:tblBorders>
+          <w:top w:val="single" w:color="auto" w:sz="4"/>
+          <w:left w:val="single" w:color="auto" w:sz="4"/>
+          <w:bottom w:val="single" w:color="auto" w:sz="4"/>
+          <w:right w:val="single" w:color="auto" w:sz="4"/>
+          <w:insideH w:val="single" w:color="auto" w:sz="4"/>
+          <w:insideV w:val="single" w:color="auto" w:sz="4"/>
+        </w:tblBorders>
+      </w:tblPr>
+      <w:tblGrid>
+        <w:gridCol w:w="907"/>
+        <w:gridCol w:w="9172"/>
+      </w:tblGrid>
+      <w:tr>
+        <w:tc>
+          <w:tcPr>
+            <w:tcW w:type="dxa" w:w="907"/>
+            <w:shd w:fill="E8A020" w:val="clear"/>
+            <w:tcMar>
+              <w:top w:type="dxa" w:w="140"/>
+              <w:left w:type="dxa" w:w="100"/>
+              <w:bottom w:type="dxa" w:w="140"/>
+              <w:right w:type="dxa" w:w="100"/>
+            </w:tcMar>
+            <w:vAlign w:val="center"/>
+          </w:tcPr>
+          <w:p>
+            <w:pPr>
+              <w:jc w:val="center"/>
+            </w:pPr>
+            <w:r>
+              <w:rPr>
+                <w:b/>
+                <w:bCs/>
+                <w:color w:val="FFFFFF"/>
+                <w:sz w:val="30"/>
+                <w:szCs w:val="30"/>
+              </w:rPr>
+              <w:t xml:space="preserve">3</w:t>
+            </w:r>
+          </w:p>
+        </w:tc>
+        <w:tc>
+          <w:tcPr>
+            <w:tcW w:type="dxa" w:w="9172"/>
+            <w:shd w:fill="D6E4F0" w:val="clear"/>
+            <w:tcMar>
+              <w:top w:type="dxa" w:w="140"/>
+              <w:left w:type="dxa" w:w="200"/>
+              <w:bottom w:type="dxa" w:w="140"/>
+              <w:right w:type="dxa" w:w="200"/>
+            </w:tcMar>
+          </w:tcPr>
+          <w:p>
+            <w:pPr>
+              <w:spacing w:after="40"/>
+            </w:pPr>
+            <w:r>
+              <w:rPr>
+                <w:b/>
+                <w:bCs/>
+                <w:color w:val="1B3F6E"/>
+                <w:sz w:val="21"/>
+                <w:szCs w:val="21"/>
+              </w:rPr>
+              <w:t xml:space="preserve">Recherche par similarité</w:t>
+            </w:r>
+          </w:p>
+          <w:p>
+            <w:r>
+              <w:rPr>
+                <w:color w:val="1F2937"/>
+                <w:sz w:val="19"/>
+                <w:szCs w:val="19"/>
+              </w:rPr>
+              <w:t xml:space="preserve">Quand une question arrive, elle est elle aussi transformée en vecteur, puis comparée mathématiquement à tous les vecteurs déjà stockés pour retrouver les morceaux de texte les plus proches en signification.</w:t>
+            </w:r>
+          </w:p>
+        </w:tc>
+      </w:tr>
+    </w:tbl>
+    <w:p>
+      <w:pPr>
+        <w:spacing w:after="80"/>
+      </w:pPr>
+    </w:p>
+    <w:tbl>
+      <w:tblPr>
+        <w:tblW w:type="dxa" w:w="10080"/>
+        <w:tblBorders>
+          <w:top w:val="single" w:color="auto" w:sz="4"/>
+          <w:left w:val="single" w:color="auto" w:sz="4"/>
+          <w:bottom w:val="single" w:color="auto" w:sz="4"/>
+          <w:right w:val="single" w:color="auto" w:sz="4"/>
+          <w:insideH w:val="single" w:color="auto" w:sz="4"/>
+          <w:insideV w:val="single" w:color="auto" w:sz="4"/>
+        </w:tblBorders>
+      </w:tblPr>
+      <w:tblGrid>
+        <w:gridCol w:w="907"/>
+        <w:gridCol w:w="9172"/>
+      </w:tblGrid>
+      <w:tr>
+        <w:tc>
+          <w:tcPr>
+            <w:tcW w:type="dxa" w:w="907"/>
+            <w:shd w:fill="1B3F6E" w:val="clear"/>
+            <w:tcMar>
+              <w:top w:type="dxa" w:w="140"/>
+              <w:left w:type="dxa" w:w="100"/>
+              <w:bottom w:type="dxa" w:w="140"/>
+              <w:right w:type="dxa" w:w="100"/>
+            </w:tcMar>
+            <w:vAlign w:val="center"/>
+          </w:tcPr>
+          <w:p>
+            <w:pPr>
+              <w:jc w:val="center"/>
+            </w:pPr>
+            <w:r>
+              <w:rPr>
+                <w:b/>
+                <w:bCs/>
+                <w:color w:val="FFFFFF"/>
+                <w:sz w:val="30"/>
+                <w:szCs w:val="30"/>
+              </w:rPr>
+              <w:t xml:space="preserve">4</w:t>
+            </w:r>
+          </w:p>
+        </w:tc>
+        <w:tc>
+          <w:tcPr>
+            <w:tcW w:type="dxa" w:w="9172"/>
+            <w:shd w:fill="D6E4F0" w:val="clear"/>
+            <w:tcMar>
+              <w:top w:type="dxa" w:w="140"/>
+              <w:left w:type="dxa" w:w="200"/>
+              <w:bottom w:type="dxa" w:w="140"/>
+              <w:right w:type="dxa" w:w="200"/>
+            </w:tcMar>
+          </w:tcPr>
+          <w:p>
+            <w:pPr>
+              <w:spacing w:after="40"/>
+            </w:pPr>
+            <w:r>
+              <w:rPr>
+                <w:b/>
+                <w:bCs/>
+                <w:color w:val="1B3F6E"/>
+                <w:sz w:val="21"/>
+                <w:szCs w:val="21"/>
+              </w:rPr>
+              <w:t xml:space="preserve">Génération de la réponse</w:t>
+            </w:r>
+          </w:p>
+          <w:p>
+            <w:r>
+              <w:rPr>
+                <w:color w:val="1F2937"/>
+                <w:sz w:val="19"/>
+                <w:szCs w:val="19"/>
+              </w:rPr>
+              <w:t xml:space="preserve">Les morceaux retrouvés sont transmis à un modèle de langage, qui rédige une réponse claire en s'appuyant sur ces sources, plutôt que sur sa seule mémoire générale.</w:t>
+            </w:r>
+          </w:p>
+        </w:tc>
+      </w:tr>
+    </w:tbl>
+    <w:p>
+      <w:pPr>
+        <w:spacing w:after="200"/>
+      </w:pPr>
     </w:p>
     <w:p>
       <w:pPr>
@@ -908,7 +1526,7 @@
         <w:rPr>
           <w:b/>
           <w:bCs/>
-          <w:color w:val="10263F"/>
+          <w:color w:val="1B3F6E"/>
           <w:sz w:val="23"/>
           <w:szCs w:val="23"/>
         </w:rPr>
@@ -937,7 +1555,7 @@
         <w:tc>
           <w:tcPr>
             <w:tcW w:type="dxa" w:w="2217"/>
-            <w:shd w:fill="10263F" w:val="clear"/>
+            <w:shd w:fill="1B3F6E" w:val="clear"/>
             <w:tcMar>
               <w:top w:type="dxa" w:w="100"/>
               <w:left w:type="dxa" w:w="120"/>
@@ -954,14 +1572,14 @@
                 <w:sz w:val="18"/>
                 <w:szCs w:val="18"/>
               </w:rPr>
-              <w:t xml:space="preserve">ASPECT</w:t>
+              <w:t xml:space="preserve">Aspect</w:t>
             </w:r>
           </w:p>
         </w:tc>
         <w:tc>
           <w:tcPr>
             <w:tcW w:type="dxa" w:w="2620"/>
-            <w:shd w:fill="10263F" w:val="clear"/>
+            <w:shd w:fill="1B3F6E" w:val="clear"/>
             <w:tcMar>
               <w:top w:type="dxa" w:w="100"/>
               <w:left w:type="dxa" w:w="120"/>
@@ -978,14 +1596,14 @@
                 <w:sz w:val="18"/>
                 <w:szCs w:val="18"/>
               </w:rPr>
-              <w:t xml:space="preserve">MOTEUR DE RECHERCHE CLASSIQUE</w:t>
+              <w:t xml:space="preserve">Moteur de recherche classique</w:t>
             </w:r>
           </w:p>
         </w:tc>
         <w:tc>
           <w:tcPr>
             <w:tcW w:type="dxa" w:w="2620"/>
-            <w:shd w:fill="10263F" w:val="clear"/>
+            <w:shd w:fill="1B3F6E" w:val="clear"/>
             <w:tcMar>
               <w:top w:type="dxa" w:w="100"/>
               <w:left w:type="dxa" w:w="120"/>
@@ -1002,14 +1620,14 @@
                 <w:sz w:val="18"/>
                 <w:szCs w:val="18"/>
               </w:rPr>
-              <w:t xml:space="preserve">CHATBOT IA GÉNÉRIQUE</w:t>
+              <w:t xml:space="preserve">Chatbot IA générique</w:t>
             </w:r>
           </w:p>
         </w:tc>
         <w:tc>
           <w:tcPr>
             <w:tcW w:type="dxa" w:w="2620"/>
-            <w:shd w:fill="10263F" w:val="clear"/>
+            <w:shd w:fill="1B3F6E" w:val="clear"/>
             <w:tcMar>
               <w:top w:type="dxa" w:w="100"/>
               <w:left w:type="dxa" w:w="120"/>
@@ -1026,7 +1644,7 @@
                 <w:sz w:val="18"/>
                 <w:szCs w:val="18"/>
               </w:rPr>
-              <w:t xml:space="preserve">SYSTÈME RAG</w:t>
+              <w:t xml:space="preserve">Système RAG</w:t>
             </w:r>
           </w:p>
         </w:tc>
@@ -1133,7 +1751,7 @@
         <w:tc>
           <w:tcPr>
             <w:tcW w:type="dxa" w:w="2217"/>
-            <w:shd w:fill="F4F6F9" w:val="clear"/>
+            <w:shd w:fill="F4F4F4" w:val="clear"/>
             <w:tcMar>
               <w:top w:type="dxa" w:w="100"/>
               <w:left w:type="dxa" w:w="120"/>
@@ -1157,7 +1775,7 @@
         <w:tc>
           <w:tcPr>
             <w:tcW w:type="dxa" w:w="2620"/>
-            <w:shd w:fill="F4F6F9" w:val="clear"/>
+            <w:shd w:fill="F4F4F4" w:val="clear"/>
             <w:tcMar>
               <w:top w:type="dxa" w:w="100"/>
               <w:left w:type="dxa" w:w="120"/>
@@ -1181,7 +1799,7 @@
         <w:tc>
           <w:tcPr>
             <w:tcW w:type="dxa" w:w="2620"/>
-            <w:shd w:fill="F4F6F9" w:val="clear"/>
+            <w:shd w:fill="F4F4F4" w:val="clear"/>
             <w:tcMar>
               <w:top w:type="dxa" w:w="100"/>
               <w:left w:type="dxa" w:w="120"/>
@@ -1205,7 +1823,7 @@
         <w:tc>
           <w:tcPr>
             <w:tcW w:type="dxa" w:w="2620"/>
-            <w:shd w:fill="F4F6F9" w:val="clear"/>
+            <w:shd w:fill="F4F4F4" w:val="clear"/>
             <w:tcMar>
               <w:top w:type="dxa" w:w="100"/>
               <w:left w:type="dxa" w:w="120"/>
@@ -1328,6 +1946,11 @@
     </w:tbl>
     <w:p>
       <w:pPr>
+        <w:spacing w:after="200"/>
+      </w:pPr>
+    </w:p>
+    <w:p>
+      <w:pPr>
         <w:pStyle w:val="Heading2"/>
         <w:spacing w:after="140" w:before="320"/>
       </w:pPr>
@@ -1335,7 +1958,7 @@
         <w:rPr>
           <w:b/>
           <w:bCs/>
-          <w:color w:val="10263F"/>
+          <w:color w:val="1B3F6E"/>
           <w:sz w:val="23"/>
           <w:szCs w:val="23"/>
         </w:rPr>
@@ -1397,7 +2020,7 @@
         <w:tc>
           <w:tcPr>
             <w:tcW w:type="dxa" w:w="2016"/>
-            <w:shd w:fill="10263F" w:val="clear"/>
+            <w:shd w:fill="1B3F6E" w:val="clear"/>
             <w:tcMar>
               <w:top w:type="dxa" w:w="100"/>
               <w:left w:type="dxa" w:w="120"/>
@@ -1414,14 +2037,14 @@
                 <w:sz w:val="18"/>
                 <w:szCs w:val="18"/>
               </w:rPr>
-              <w:t xml:space="preserve">SCORE</w:t>
+              <w:t xml:space="preserve">Score</w:t>
             </w:r>
           </w:p>
         </w:tc>
         <w:tc>
           <w:tcPr>
             <w:tcW w:type="dxa" w:w="5040"/>
-            <w:shd w:fill="10263F" w:val="clear"/>
+            <w:shd w:fill="1B3F6E" w:val="clear"/>
             <w:tcMar>
               <w:top w:type="dxa" w:w="100"/>
               <w:left w:type="dxa" w:w="120"/>
@@ -1438,14 +2061,14 @@
                 <w:sz w:val="18"/>
                 <w:szCs w:val="18"/>
               </w:rPr>
-              <w:t xml:space="preserve">CE QUE ÇA VEUT DIRE</w:t>
+              <w:t xml:space="preserve">Ce que ça veut dire</w:t>
             </w:r>
           </w:p>
         </w:tc>
         <w:tc>
           <w:tcPr>
             <w:tcW w:type="dxa" w:w="3024"/>
-            <w:shd w:fill="10263F" w:val="clear"/>
+            <w:shd w:fill="1B3F6E" w:val="clear"/>
             <w:tcMar>
               <w:top w:type="dxa" w:w="100"/>
               <w:left w:type="dxa" w:w="120"/>
@@ -1462,7 +2085,7 @@
                 <w:sz w:val="18"/>
                 <w:szCs w:val="18"/>
               </w:rPr>
-              <w:t xml:space="preserve">RÉPONSE UTILISABLE ?</w:t>
+              <w:t xml:space="preserve">Réponse utilisable ?</w:t>
             </w:r>
           </w:p>
         </w:tc>
@@ -1545,7 +2168,7 @@
         <w:tc>
           <w:tcPr>
             <w:tcW w:type="dxa" w:w="2016"/>
-            <w:shd w:fill="F4F6F9" w:val="clear"/>
+            <w:shd w:fill="F4F4F4" w:val="clear"/>
             <w:tcMar>
               <w:top w:type="dxa" w:w="100"/>
               <w:left w:type="dxa" w:w="120"/>
@@ -1569,7 +2192,7 @@
         <w:tc>
           <w:tcPr>
             <w:tcW w:type="dxa" w:w="5040"/>
-            <w:shd w:fill="F4F6F9" w:val="clear"/>
+            <w:shd w:fill="F4F4F4" w:val="clear"/>
             <w:tcMar>
               <w:top w:type="dxa" w:w="100"/>
               <w:left w:type="dxa" w:w="120"/>
@@ -1593,7 +2216,7 @@
         <w:tc>
           <w:tcPr>
             <w:tcW w:type="dxa" w:w="3024"/>
-            <w:shd w:fill="F4F6F9" w:val="clear"/>
+            <w:shd w:fill="F4F4F4" w:val="clear"/>
             <w:tcMar>
               <w:top w:type="dxa" w:w="100"/>
               <w:left w:type="dxa" w:w="120"/>
@@ -1693,7 +2316,7 @@
         <w:tc>
           <w:tcPr>
             <w:tcW w:type="dxa" w:w="2016"/>
-            <w:shd w:fill="F4F6F9" w:val="clear"/>
+            <w:shd w:fill="F4F4F4" w:val="clear"/>
             <w:tcMar>
               <w:top w:type="dxa" w:w="100"/>
               <w:left w:type="dxa" w:w="120"/>
@@ -1717,7 +2340,7 @@
         <w:tc>
           <w:tcPr>
             <w:tcW w:type="dxa" w:w="5040"/>
-            <w:shd w:fill="F4F6F9" w:val="clear"/>
+            <w:shd w:fill="F4F4F4" w:val="clear"/>
             <w:tcMar>
               <w:top w:type="dxa" w:w="100"/>
               <w:left w:type="dxa" w:w="120"/>
@@ -1741,7 +2364,7 @@
         <w:tc>
           <w:tcPr>
             <w:tcW w:type="dxa" w:w="3024"/>
-            <w:shd w:fill="F4F6F9" w:val="clear"/>
+            <w:shd w:fill="F4F4F4" w:val="clear"/>
             <w:tcMar>
               <w:top w:type="dxa" w:w="100"/>
               <w:left w:type="dxa" w:w="120"/>
@@ -1840,8 +2463,187 @@
     </w:tbl>
     <w:p>
       <w:pPr>
+        <w:spacing w:after="120"/>
+      </w:pPr>
+    </w:p>
+    <w:tbl>
+      <w:tblPr>
+        <w:tblW w:type="dxa" w:w="10080"/>
+        <w:tblBorders>
+          <w:top w:val="single" w:color="auto" w:sz="4"/>
+          <w:left w:val="single" w:color="auto" w:sz="4"/>
+          <w:bottom w:val="single" w:color="auto" w:sz="4"/>
+          <w:right w:val="single" w:color="auto" w:sz="4"/>
+          <w:insideH w:val="single" w:color="auto" w:sz="4"/>
+          <w:insideV w:val="single" w:color="auto" w:sz="4"/>
+        </w:tblBorders>
+      </w:tblPr>
+      <w:tblGrid>
+        <w:gridCol w:w="10080"/>
+      </w:tblGrid>
+      <w:tr>
+        <w:tc>
+          <w:tcPr>
+            <w:tcW w:type="dxa" w:w="10080"/>
+            <w:shd w:fill="D6E4F0" w:val="clear"/>
+            <w:tcMar>
+              <w:top w:type="dxa" w:w="160"/>
+              <w:left w:type="dxa" w:w="200"/>
+              <w:bottom w:type="dxa" w:w="160"/>
+              <w:right w:type="dxa" w:w="200"/>
+            </w:tcMar>
+          </w:tcPr>
+          <w:p>
+            <w:r>
+              <w:rPr>
+                <w:color w:val="1F2937"/>
+                <w:sz w:val="20"/>
+                <w:szCs w:val="20"/>
+              </w:rPr>
+              <w:t xml:space="preserve">Point important : un score affiché ne garantit pas une réponse utile. Un système RAG bien conçu reste honnête — si le contenu réel ne correspond pas assez à la question, l'IA répond « je n'ai pas trouvé cette information » plutôt que d'inventer, même quand une source apparaît dans la liste.</w:t>
+            </w:r>
+          </w:p>
+        </w:tc>
+      </w:tr>
+    </w:tbl>
+    <w:p>
+      <w:r>
+        <w:br w:type="page"/>
+      </w:r>
+    </w:p>
+    <w:p>
+      <w:pPr>
+        <w:pStyle w:val="Heading1"/>
         <w:pBdr>
-          <w:left w:val="single" w:color="1E8A99" w:sz="12" w:space="8"/>
+          <w:bottom w:val="single" w:color="E8A020" w:sz="8" w:space="6"/>
+        </w:pBdr>
+        <w:spacing w:after="200" w:before="480"/>
+      </w:pPr>
+      <w:r>
+        <w:rPr>
+          <w:b/>
+          <w:bCs/>
+          <w:color w:val="1B3F6E"/>
+          <w:sz w:val="30"/>
+          <w:szCs w:val="30"/>
+        </w:rPr>
+        <w:t xml:space="preserve">Partie 2 — Le cas d'usage TransferAI Africa</w:t>
+      </w:r>
+    </w:p>
+    <w:p>
+      <w:pPr>
+        <w:spacing w:after="160" w:line="300"/>
+      </w:pPr>
+      <w:r>
+        <w:rPr>
+          <w:b w:val="false"/>
+          <w:bCs w:val="false"/>
+          <w:i w:val="false"/>
+          <w:iCs w:val="false"/>
+          <w:color w:val="1F2937"/>
+          <w:sz w:val="21"/>
+          <w:szCs w:val="21"/>
+        </w:rPr>
+        <w:t xml:space="preserve">Cette partie décrit un système RAG réellement construit et exploité en production par TransferAI Africa depuis juillet 2026 — non pas comme un exemple théorique, mais comme le cas de référence sur lequel s'appuie ce guide pour démontrer, preuves à l'appui, ce qu'un RAG peut apporter à toute organisation disposant d'une documentation interne, quel que soit son secteur.</w:t>
+      </w:r>
+    </w:p>
+    <w:tbl>
+      <w:tblPr>
+        <w:tblW w:type="dxa" w:w="10080"/>
+        <w:tblBorders>
+          <w:top w:val="single" w:color="auto" w:sz="4"/>
+          <w:left w:val="single" w:color="auto" w:sz="4"/>
+          <w:bottom w:val="single" w:color="auto" w:sz="4"/>
+          <w:right w:val="single" w:color="auto" w:sz="4"/>
+          <w:insideH w:val="single" w:color="auto" w:sz="4"/>
+          <w:insideV w:val="single" w:color="auto" w:sz="4"/>
+        </w:tblBorders>
+      </w:tblPr>
+      <w:tblGrid>
+        <w:gridCol w:w="10080"/>
+      </w:tblGrid>
+      <w:tr>
+        <w:tc>
+          <w:tcPr>
+            <w:tcW w:type="dxa" w:w="10080"/>
+            <w:shd w:fill="D6E4F0" w:val="clear"/>
+            <w:tcMar>
+              <w:top w:type="dxa" w:w="160"/>
+              <w:left w:type="dxa" w:w="200"/>
+              <w:bottom w:type="dxa" w:w="160"/>
+              <w:right w:type="dxa" w:w="200"/>
+            </w:tcMar>
+          </w:tcPr>
+          <w:p>
+            <w:pPr>
+              <w:spacing w:after="80"/>
+            </w:pPr>
+            <w:r>
+              <w:rPr>
+                <w:b/>
+                <w:bCs/>
+                <w:color w:val="1B3F6E"/>
+                <w:sz w:val="20"/>
+                <w:szCs w:val="20"/>
+              </w:rPr>
+              <w:t xml:space="preserve">Le cas de référence de ce guide</w:t>
+            </w:r>
+          </w:p>
+          <w:p>
+            <w:r>
+              <w:rPr>
+                <w:color w:val="1F2937"/>
+                <w:sz w:val="20"/>
+                <w:szCs w:val="20"/>
+              </w:rPr>
+              <w:t xml:space="preserve">Tout ce qui est décrit dans cette partie n'est pas une simulation : c'est le système RAG réellement en production chez TransferAI Africa, avec de vraies exécutions, de vrais scores de similarité et de vraies réponses vérifiées (voir 2.4). C'est ce cas concret qui sert de preuve terrain pour convaincre qu'un projet RAG est réalisable, mesurable et réplicable.</w:t>
+            </w:r>
+          </w:p>
+        </w:tc>
+      </w:tr>
+    </w:tbl>
+    <w:p>
+      <w:pPr>
+        <w:spacing w:after="160"/>
+      </w:pPr>
+    </w:p>
+    <w:p>
+      <w:pPr>
+        <w:pStyle w:val="Heading2"/>
+        <w:spacing w:after="140" w:before="320"/>
+      </w:pPr>
+      <w:r>
+        <w:rPr>
+          <w:b/>
+          <w:bCs/>
+          <w:color w:val="1B3F6E"/>
+          <w:sz w:val="23"/>
+          <w:szCs w:val="23"/>
+        </w:rPr>
+        <w:t xml:space="preserve">2.1 Le problème rencontré</w:t>
+      </w:r>
+    </w:p>
+    <w:p>
+      <w:pPr>
+        <w:spacing w:after="160" w:line="300"/>
+      </w:pPr>
+      <w:r>
+        <w:rPr>
+          <w:b w:val="false"/>
+          <w:bCs w:val="false"/>
+          <w:i w:val="false"/>
+          <w:iCs w:val="false"/>
+          <w:color w:val="1F2937"/>
+          <w:sz w:val="21"/>
+          <w:szCs w:val="21"/>
+        </w:rPr>
+        <w:t xml:space="preserve">TransferAI Africa accompagne des entreprises africaines dans leur transition vers l'intelligence artificielle. Comme beaucoup d'organisations en croissance rapide, l'équipe faisait face à un défi commun : des centaines de documents internes — procédures, guides, réglementations, decks sectoriels — dispersés sur des drives, impossibles à retrouver rapidement.</w:t>
+      </w:r>
+    </w:p>
+    <w:p>
+      <w:pPr>
+        <w:pBdr>
+          <w:left w:val="single" w:color="E8A020" w:sz="12" w:space="8"/>
         </w:pBdr>
         <w:spacing w:after="200" w:before="100"/>
         <w:ind w:left="260"/>
@@ -1854,112 +2656,19 @@
           <w:sz w:val="20"/>
           <w:szCs w:val="20"/>
         </w:rPr>
-        <w:t xml:space="preserve">Point important : un score affiché ne garantit pas une réponse utile. Un système RAG bien conçu reste honnête — si le contenu réel ne correspond pas assez à la question, l'IA répond « je n'ai pas trouvé cette information » plutôt que d'inventer, même quand une source apparaît dans la liste.</w:t>
-      </w:r>
-    </w:p>
-    <w:p>
-      <w:r>
-        <w:br w:type="page"/>
-      </w:r>
-    </w:p>
-    <w:p>
-      <w:pPr>
-        <w:pStyle w:val="Heading1"/>
-        <w:pBdr>
-          <w:bottom w:val="single" w:color="1E8A99" w:sz="8" w:space="6"/>
-        </w:pBdr>
-        <w:spacing w:after="200" w:before="480"/>
+        <w:t xml:space="preserve">Mesuré concrètement chez TransferAI : les consultants perdaient en moyenne 2 heures par jour à chercher des informations dans leurs propres documents, soit environ 30 minutes perdues à chaque recherche.</w:t>
+      </w:r>
+    </w:p>
+    <w:p>
+      <w:pPr>
+        <w:pStyle w:val="Heading2"/>
+        <w:spacing w:after="140" w:before="320"/>
       </w:pPr>
       <w:r>
         <w:rPr>
           <w:b/>
           <w:bCs/>
-          <w:color w:val="10263F"/>
-          <w:sz w:val="30"/>
-          <w:szCs w:val="30"/>
-        </w:rPr>
-        <w:t xml:space="preserve">Partie 2 — Le cas d'usage TransferAI Africa</w:t>
-      </w:r>
-    </w:p>
-    <w:p>
-      <w:pPr>
-        <w:spacing w:after="160" w:line="300"/>
-      </w:pPr>
-      <w:r>
-        <w:rPr>
-          <w:b w:val="false"/>
-          <w:bCs w:val="false"/>
-          <w:i w:val="false"/>
-          <w:iCs w:val="false"/>
-          <w:color w:val="1F2937"/>
-          <w:sz w:val="21"/>
-          <w:szCs w:val="21"/>
-        </w:rPr>
-        <w:t xml:space="preserve">Cette partie décrit un système RAG réellement construit et exploité en production par TransferAI Africa depuis juillet 2026 — non pas comme un exemple théorique, mais comme un cas de référence reproductible par toute organisation disposant d'une documentation interne, quel que soit son secteur.</w:t>
-      </w:r>
-    </w:p>
-    <w:p>
-      <w:pPr>
-        <w:pStyle w:val="Heading2"/>
-        <w:spacing w:after="140" w:before="320"/>
-      </w:pPr>
-      <w:r>
-        <w:rPr>
-          <w:b/>
-          <w:bCs/>
-          <w:color w:val="10263F"/>
-          <w:sz w:val="23"/>
-          <w:szCs w:val="23"/>
-        </w:rPr>
-        <w:t xml:space="preserve">2.1 Le problème rencontré</w:t>
-      </w:r>
-    </w:p>
-    <w:p>
-      <w:pPr>
-        <w:spacing w:after="160" w:line="300"/>
-      </w:pPr>
-      <w:r>
-        <w:rPr>
-          <w:b w:val="false"/>
-          <w:bCs w:val="false"/>
-          <w:i w:val="false"/>
-          <w:iCs w:val="false"/>
-          <w:color w:val="1F2937"/>
-          <w:sz w:val="21"/>
-          <w:szCs w:val="21"/>
-        </w:rPr>
-        <w:t xml:space="preserve">TransferAI Africa accompagne des entreprises africaines dans leur transition vers l'intelligence artificielle. Comme beaucoup d'organisations en croissance rapide, l'équipe faisait face à un défi commun : des centaines de documents internes — procédures, guides, réglementations, decks sectoriels — dispersés sur des drives, impossibles à retrouver rapidement.</w:t>
-      </w:r>
-    </w:p>
-    <w:p>
-      <w:pPr>
-        <w:pBdr>
-          <w:left w:val="single" w:color="1E8A99" w:sz="12" w:space="8"/>
-        </w:pBdr>
-        <w:spacing w:after="200" w:before="100"/>
-        <w:ind w:left="260"/>
-      </w:pPr>
-      <w:r>
-        <w:rPr>
-          <w:i/>
-          <w:iCs/>
-          <w:color w:val="6B7280"/>
-          <w:sz w:val="20"/>
-          <w:szCs w:val="20"/>
-        </w:rPr>
-        <w:t xml:space="preserve">Mesuré concrètement chez TransferAI : les consultants perdaient en moyenne 2 heures par jour à chercher des informations dans leurs propres documents, soit environ 30 minutes perdues à chaque recherche.</w:t>
-      </w:r>
-    </w:p>
-    <w:p>
-      <w:pPr>
-        <w:pStyle w:val="Heading2"/>
-        <w:spacing w:after="140" w:before="320"/>
-      </w:pPr>
-      <w:r>
-        <w:rPr>
-          <w:b/>
-          <w:bCs/>
-          <w:color w:val="10263F"/>
+          <w:color w:val="1B3F6E"/>
           <w:sz w:val="23"/>
           <w:szCs w:val="23"/>
         </w:rPr>
@@ -2003,7 +2712,7 @@
         <w:tc>
           <w:tcPr>
             <w:tcW w:type="dxa" w:w="3024"/>
-            <w:shd w:fill="10263F" w:val="clear"/>
+            <w:shd w:fill="1B3F6E" w:val="clear"/>
             <w:tcMar>
               <w:top w:type="dxa" w:w="100"/>
               <w:left w:type="dxa" w:w="120"/>
@@ -2020,14 +2729,14 @@
                 <w:sz w:val="18"/>
                 <w:szCs w:val="18"/>
               </w:rPr>
-              <w:t xml:space="preserve">ÉLÉMENT DU WORKFLOW</w:t>
+              <w:t xml:space="preserve">Élément du workflow</w:t>
             </w:r>
           </w:p>
         </w:tc>
         <w:tc>
           <w:tcPr>
             <w:tcW w:type="dxa" w:w="7056"/>
-            <w:shd w:fill="10263F" w:val="clear"/>
+            <w:shd w:fill="1B3F6E" w:val="clear"/>
             <w:tcMar>
               <w:top w:type="dxa" w:w="100"/>
               <w:left w:type="dxa" w:w="120"/>
@@ -2044,7 +2753,7 @@
                 <w:sz w:val="18"/>
                 <w:szCs w:val="18"/>
               </w:rPr>
-              <w:t xml:space="preserve">RÔLE</w:t>
+              <w:t xml:space="preserve">Rôle</w:t>
             </w:r>
           </w:p>
         </w:tc>
@@ -2103,7 +2812,7 @@
         <w:tc>
           <w:tcPr>
             <w:tcW w:type="dxa" w:w="3024"/>
-            <w:shd w:fill="F4F6F9" w:val="clear"/>
+            <w:shd w:fill="F4F4F4" w:val="clear"/>
             <w:tcMar>
               <w:top w:type="dxa" w:w="100"/>
               <w:left w:type="dxa" w:w="120"/>
@@ -2127,7 +2836,7 @@
         <w:tc>
           <w:tcPr>
             <w:tcW w:type="dxa" w:w="7056"/>
-            <w:shd w:fill="F4F6F9" w:val="clear"/>
+            <w:shd w:fill="F4F4F4" w:val="clear"/>
             <w:tcMar>
               <w:top w:type="dxa" w:w="100"/>
               <w:left w:type="dxa" w:w="120"/>
@@ -2203,7 +2912,7 @@
         <w:tc>
           <w:tcPr>
             <w:tcW w:type="dxa" w:w="3024"/>
-            <w:shd w:fill="F4F6F9" w:val="clear"/>
+            <w:shd w:fill="F4F4F4" w:val="clear"/>
             <w:tcMar>
               <w:top w:type="dxa" w:w="100"/>
               <w:left w:type="dxa" w:w="120"/>
@@ -2227,7 +2936,7 @@
         <w:tc>
           <w:tcPr>
             <w:tcW w:type="dxa" w:w="7056"/>
-            <w:shd w:fill="F4F6F9" w:val="clear"/>
+            <w:shd w:fill="F4F4F4" w:val="clear"/>
             <w:tcMar>
               <w:top w:type="dxa" w:w="100"/>
               <w:left w:type="dxa" w:w="120"/>
@@ -2251,6 +2960,11 @@
       </w:tr>
     </w:tbl>
     <w:p>
+      <w:r>
+        <w:br w:type="page"/>
+      </w:r>
+    </w:p>
+    <w:p>
       <w:pPr>
         <w:pStyle w:val="Heading2"/>
         <w:spacing w:after="140" w:before="320"/>
@@ -2259,7 +2973,7 @@
         <w:rPr>
           <w:b/>
           <w:bCs/>
-          <w:color w:val="10263F"/>
+          <w:color w:val="1B3F6E"/>
           <w:sz w:val="23"/>
           <w:szCs w:val="23"/>
         </w:rPr>
@@ -2274,7 +2988,7 @@
         <w:rPr>
           <w:b/>
           <w:bCs/>
-          <w:color w:val="1E8A99"/>
+          <w:color w:val="0D7D6B"/>
           <w:sz w:val="21"/>
           <w:szCs w:val="21"/>
         </w:rPr>
@@ -2355,13 +3069,18 @@
     </w:p>
     <w:p>
       <w:pPr>
+        <w:spacing w:after="120"/>
+      </w:pPr>
+    </w:p>
+    <w:p>
+      <w:pPr>
         <w:spacing w:after="100" w:before="200"/>
       </w:pPr>
       <w:r>
         <w:rPr>
           <w:b/>
           <w:bCs/>
-          <w:color w:val="1E8A99"/>
+          <w:color w:val="0D7D6B"/>
           <w:sz w:val="21"/>
           <w:szCs w:val="21"/>
         </w:rPr>
@@ -2460,6 +3179,11 @@
     </w:p>
     <w:p>
       <w:pPr>
+        <w:spacing w:after="160"/>
+      </w:pPr>
+    </w:p>
+    <w:p>
+      <w:pPr>
         <w:pStyle w:val="Heading2"/>
         <w:spacing w:after="140" w:before="320"/>
       </w:pPr>
@@ -2467,7 +3191,7 @@
         <w:rPr>
           <w:b/>
           <w:bCs/>
-          <w:color w:val="10263F"/>
+          <w:color w:val="1B3F6E"/>
           <w:sz w:val="23"/>
           <w:szCs w:val="23"/>
         </w:rPr>
@@ -2494,7 +3218,7 @@
     <w:p>
       <w:pPr>
         <w:pBdr>
-          <w:left w:val="single" w:color="1E8A99" w:sz="12" w:space="8"/>
+          <w:left w:val="single" w:color="E8A020" w:sz="12" w:space="8"/>
         </w:pBdr>
         <w:spacing w:after="200" w:before="100"/>
         <w:ind w:left="260"/>
@@ -2553,7 +3277,7 @@
       <w:pPr>
         <w:pStyle w:val="Heading1"/>
         <w:pBdr>
-          <w:bottom w:val="single" w:color="1E8A99" w:sz="8" w:space="6"/>
+          <w:bottom w:val="single" w:color="E8A020" w:sz="8" w:space="6"/>
         </w:pBdr>
         <w:spacing w:after="200" w:before="480"/>
       </w:pPr>
@@ -2561,7 +3285,7 @@
         <w:rPr>
           <w:b/>
           <w:bCs/>
-          <w:color w:val="10263F"/>
+          <w:color w:val="1B3F6E"/>
           <w:sz w:val="30"/>
           <w:szCs w:val="30"/>
         </w:rPr>
@@ -2577,7 +3301,7 @@
         <w:rPr>
           <w:b/>
           <w:bCs/>
-          <w:color w:val="10263F"/>
+          <w:color w:val="1B3F6E"/>
           <w:sz w:val="23"/>
           <w:szCs w:val="23"/>
         </w:rPr>
@@ -2605,7 +3329,7 @@
         <w:tc>
           <w:tcPr>
             <w:tcW w:type="dxa" w:w="2016"/>
-            <w:shd w:fill="10263F" w:val="clear"/>
+            <w:shd w:fill="1B3F6E" w:val="clear"/>
             <w:tcMar>
               <w:top w:type="dxa" w:w="100"/>
               <w:left w:type="dxa" w:w="120"/>
@@ -2622,14 +3346,14 @@
                 <w:sz w:val="18"/>
                 <w:szCs w:val="18"/>
               </w:rPr>
-              <w:t xml:space="preserve">DIMENSION</w:t>
+              <w:t xml:space="preserve">Dimension</w:t>
             </w:r>
           </w:p>
         </w:tc>
         <w:tc>
           <w:tcPr>
             <w:tcW w:type="dxa" w:w="4032"/>
-            <w:shd w:fill="10263F" w:val="clear"/>
+            <w:shd w:fill="1B3F6E" w:val="clear"/>
             <w:tcMar>
               <w:top w:type="dxa" w:w="100"/>
               <w:left w:type="dxa" w:w="120"/>
@@ -2653,7 +3377,7 @@
         <w:tc>
           <w:tcPr>
             <w:tcW w:type="dxa" w:w="4032"/>
-            <w:shd w:fill="10263F" w:val="clear"/>
+            <w:shd w:fill="1B3F6E" w:val="clear"/>
             <w:tcMar>
               <w:top w:type="dxa" w:w="100"/>
               <w:left w:type="dxa" w:w="120"/>
@@ -2753,7 +3477,7 @@
         <w:tc>
           <w:tcPr>
             <w:tcW w:type="dxa" w:w="2016"/>
-            <w:shd w:fill="F4F6F9" w:val="clear"/>
+            <w:shd w:fill="F4F4F4" w:val="clear"/>
             <w:tcMar>
               <w:top w:type="dxa" w:w="100"/>
               <w:left w:type="dxa" w:w="120"/>
@@ -2777,7 +3501,7 @@
         <w:tc>
           <w:tcPr>
             <w:tcW w:type="dxa" w:w="4032"/>
-            <w:shd w:fill="F4F6F9" w:val="clear"/>
+            <w:shd w:fill="F4F4F4" w:val="clear"/>
             <w:tcMar>
               <w:top w:type="dxa" w:w="100"/>
               <w:left w:type="dxa" w:w="120"/>
@@ -2801,7 +3525,7 @@
         <w:tc>
           <w:tcPr>
             <w:tcW w:type="dxa" w:w="4032"/>
-            <w:shd w:fill="F4F6F9" w:val="clear"/>
+            <w:shd w:fill="F4F4F4" w:val="clear"/>
             <w:tcMar>
               <w:top w:type="dxa" w:w="100"/>
               <w:left w:type="dxa" w:w="120"/>
@@ -2901,7 +3625,7 @@
         <w:tc>
           <w:tcPr>
             <w:tcW w:type="dxa" w:w="2016"/>
-            <w:shd w:fill="F4F6F9" w:val="clear"/>
+            <w:shd w:fill="F4F4F4" w:val="clear"/>
             <w:tcMar>
               <w:top w:type="dxa" w:w="100"/>
               <w:left w:type="dxa" w:w="120"/>
@@ -2925,7 +3649,7 @@
         <w:tc>
           <w:tcPr>
             <w:tcW w:type="dxa" w:w="4032"/>
-            <w:shd w:fill="F4F6F9" w:val="clear"/>
+            <w:shd w:fill="F4F4F4" w:val="clear"/>
             <w:tcMar>
               <w:top w:type="dxa" w:w="100"/>
               <w:left w:type="dxa" w:w="120"/>
@@ -2949,7 +3673,7 @@
         <w:tc>
           <w:tcPr>
             <w:tcW w:type="dxa" w:w="4032"/>
-            <w:shd w:fill="F4F6F9" w:val="clear"/>
+            <w:shd w:fill="F4F4F4" w:val="clear"/>
             <w:tcMar>
               <w:top w:type="dxa" w:w="100"/>
               <w:left w:type="dxa" w:w="120"/>
@@ -3049,7 +3773,7 @@
         <w:tc>
           <w:tcPr>
             <w:tcW w:type="dxa" w:w="2016"/>
-            <w:shd w:fill="F4F6F9" w:val="clear"/>
+            <w:shd w:fill="F4F4F4" w:val="clear"/>
             <w:tcMar>
               <w:top w:type="dxa" w:w="100"/>
               <w:left w:type="dxa" w:w="120"/>
@@ -3073,7 +3797,7 @@
         <w:tc>
           <w:tcPr>
             <w:tcW w:type="dxa" w:w="4032"/>
-            <w:shd w:fill="F4F6F9" w:val="clear"/>
+            <w:shd w:fill="F4F4F4" w:val="clear"/>
             <w:tcMar>
               <w:top w:type="dxa" w:w="100"/>
               <w:left w:type="dxa" w:w="120"/>
@@ -3097,7 +3821,7 @@
         <w:tc>
           <w:tcPr>
             <w:tcW w:type="dxa" w:w="4032"/>
-            <w:shd w:fill="F4F6F9" w:val="clear"/>
+            <w:shd w:fill="F4F4F4" w:val="clear"/>
             <w:tcMar>
               <w:top w:type="dxa" w:w="100"/>
               <w:left w:type="dxa" w:w="120"/>
@@ -3122,6 +3846,11 @@
     </w:tbl>
     <w:p>
       <w:pPr>
+        <w:spacing w:after="200"/>
+      </w:pPr>
+    </w:p>
+    <w:p>
+      <w:pPr>
         <w:pStyle w:val="Heading2"/>
         <w:spacing w:after="140" w:before="320"/>
       </w:pPr>
@@ -3129,7 +3858,7 @@
         <w:rPr>
           <w:b/>
           <w:bCs/>
-          <w:color w:val="10263F"/>
+          <w:color w:val="1B3F6E"/>
           <w:sz w:val="23"/>
           <w:szCs w:val="23"/>
         </w:rPr>
@@ -3173,7 +3902,7 @@
         <w:tc>
           <w:tcPr>
             <w:tcW w:type="dxa" w:w="2620"/>
-            <w:shd w:fill="10263F" w:val="clear"/>
+            <w:shd w:fill="1B3F6E" w:val="clear"/>
             <w:tcMar>
               <w:top w:type="dxa" w:w="100"/>
               <w:left w:type="dxa" w:w="120"/>
@@ -3190,14 +3919,14 @@
                 <w:sz w:val="18"/>
                 <w:szCs w:val="18"/>
               </w:rPr>
-              <w:t xml:space="preserve">BÉNÉFICE</w:t>
+              <w:t xml:space="preserve">Bénéfice</w:t>
             </w:r>
           </w:p>
         </w:tc>
         <w:tc>
           <w:tcPr>
             <w:tcW w:type="dxa" w:w="7459"/>
-            <w:shd w:fill="10263F" w:val="clear"/>
+            <w:shd w:fill="1B3F6E" w:val="clear"/>
             <w:tcMar>
               <w:top w:type="dxa" w:w="100"/>
               <w:left w:type="dxa" w:w="120"/>
@@ -3214,7 +3943,7 @@
                 <w:sz w:val="18"/>
                 <w:szCs w:val="18"/>
               </w:rPr>
-              <w:t xml:space="preserve">CE QUE CELA SIGNIFIE EN PRATIQUE</w:t>
+              <w:t xml:space="preserve">Ce que cela signifie en pratique</w:t>
             </w:r>
           </w:p>
         </w:tc>
@@ -3273,7 +4002,7 @@
         <w:tc>
           <w:tcPr>
             <w:tcW w:type="dxa" w:w="2620"/>
-            <w:shd w:fill="F4F6F9" w:val="clear"/>
+            <w:shd w:fill="F4F4F4" w:val="clear"/>
             <w:tcMar>
               <w:top w:type="dxa" w:w="100"/>
               <w:left w:type="dxa" w:w="120"/>
@@ -3297,7 +4026,7 @@
         <w:tc>
           <w:tcPr>
             <w:tcW w:type="dxa" w:w="7459"/>
-            <w:shd w:fill="F4F6F9" w:val="clear"/>
+            <w:shd w:fill="F4F4F4" w:val="clear"/>
             <w:tcMar>
               <w:top w:type="dxa" w:w="100"/>
               <w:left w:type="dxa" w:w="120"/>
@@ -3370,6 +4099,11 @@
         </w:tc>
       </w:tr>
     </w:tbl>
+    <w:p>
+      <w:pPr>
+        <w:spacing w:after="120"/>
+      </w:pPr>
+    </w:p>
     <w:p>
       <w:pPr>
         <w:spacing w:after="160" w:line="300"/>
@@ -3388,15 +4122,10 @@
       </w:r>
     </w:p>
     <w:p>
-      <w:r>
-        <w:br w:type="page"/>
-      </w:r>
-    </w:p>
-    <w:p>
       <w:pPr>
         <w:pStyle w:val="Heading1"/>
         <w:pBdr>
-          <w:bottom w:val="single" w:color="1E8A99" w:sz="8" w:space="6"/>
+          <w:bottom w:val="single" w:color="E8A020" w:sz="8" w:space="6"/>
         </w:pBdr>
         <w:spacing w:after="200" w:before="480"/>
       </w:pPr>
@@ -3404,7 +4133,7 @@
         <w:rPr>
           <w:b/>
           <w:bCs/>
-          <w:color w:val="10263F"/>
+          <w:color w:val="1B3F6E"/>
           <w:sz w:val="30"/>
           <w:szCs w:val="30"/>
         </w:rPr>
@@ -3437,7 +4166,7 @@
         <w:rPr>
           <w:b/>
           <w:bCs/>
-          <w:color w:val="10263F"/>
+          <w:color w:val="1B3F6E"/>
           <w:sz w:val="23"/>
           <w:szCs w:val="23"/>
         </w:rPr>
@@ -3507,7 +4236,7 @@
         <w:rPr>
           <w:b/>
           <w:bCs/>
-          <w:color w:val="10263F"/>
+          <w:color w:val="1B3F6E"/>
           <w:sz w:val="23"/>
           <w:szCs w:val="23"/>
         </w:rPr>
@@ -3577,7 +4306,7 @@
         <w:rPr>
           <w:b/>
           <w:bCs/>
-          <w:color w:val="10263F"/>
+          <w:color w:val="1B3F6E"/>
           <w:sz w:val="23"/>
           <w:szCs w:val="23"/>
         </w:rPr>
@@ -3647,7 +4376,7 @@
         <w:rPr>
           <w:b/>
           <w:bCs/>
-          <w:color w:val="10263F"/>
+          <w:color w:val="1B3F6E"/>
           <w:sz w:val="23"/>
           <w:szCs w:val="23"/>
         </w:rPr>
@@ -3717,11 +4446,151 @@
         <w:rPr>
           <w:b/>
           <w:bCs/>
-          <w:color w:val="10263F"/>
+          <w:color w:val="1B3F6E"/>
           <w:sz w:val="23"/>
           <w:szCs w:val="23"/>
         </w:rPr>
-        <w:t xml:space="preserve">4.5 Et au-delà</w:t>
+        <w:t xml:space="preserve">4.5 Éducation et Pédagogie (Formation)</w:t>
+      </w:r>
+    </w:p>
+    <w:p>
+      <w:pPr>
+        <w:pStyle w:val="ListParagraph"/>
+        <w:numPr>
+          <w:ilvl w:val="0"/>
+          <w:numId w:val="2"/>
+        </w:numPr>
+        <w:spacing w:after="90"/>
+      </w:pPr>
+      <w:r>
+        <w:rPr>
+          <w:color w:val="1F2937"/>
+          <w:sz w:val="21"/>
+          <w:szCs w:val="21"/>
+        </w:rPr>
+        <w:t xml:space="preserve">Permettre à un apprenant de poser une question sur un support de cours et d'obtenir une réponse sourcée, plutôt que de devoir rechercher manuellement dans des dizaines de pages de manuels ou de polycopiés.</w:t>
+      </w:r>
+    </w:p>
+    <w:p>
+      <w:pPr>
+        <w:pStyle w:val="ListParagraph"/>
+        <w:numPr>
+          <w:ilvl w:val="0"/>
+          <w:numId w:val="2"/>
+        </w:numPr>
+        <w:spacing w:after="90"/>
+      </w:pPr>
+      <w:r>
+        <w:rPr>
+          <w:color w:val="1F2937"/>
+          <w:sz w:val="21"/>
+          <w:szCs w:val="21"/>
+        </w:rPr>
+        <w:t xml:space="preserve">Donner aux formateurs un assistant capable de retrouver instantanément un exemple, une définition ou un exercice précis dans l'ensemble du contenu pédagogique déjà produit, pour préparer une session plus rapidement.</w:t>
+      </w:r>
+    </w:p>
+    <w:p>
+      <w:pPr>
+        <w:pStyle w:val="ListParagraph"/>
+        <w:numPr>
+          <w:ilvl w:val="0"/>
+          <w:numId w:val="2"/>
+        </w:numPr>
+        <w:spacing w:after="90"/>
+      </w:pPr>
+      <w:r>
+        <w:rPr>
+          <w:color w:val="1F2937"/>
+          <w:sz w:val="21"/>
+          <w:szCs w:val="21"/>
+        </w:rPr>
+        <w:t xml:space="preserve">Offrir un accompagnement disponible en dehors des heures de cours : un apprenant peut interroger la base de connaissances de sa formation à tout moment, avec des réponses ancrées dans les supports réellement enseignés — pas des réponses génériques.</w:t>
+      </w:r>
+    </w:p>
+    <w:p>
+      <w:pPr>
+        <w:pStyle w:val="Heading2"/>
+        <w:spacing w:after="140" w:before="320"/>
+      </w:pPr>
+      <w:r>
+        <w:rPr>
+          <w:b/>
+          <w:bCs/>
+          <w:color w:val="1B3F6E"/>
+          <w:sz w:val="23"/>
+          <w:szCs w:val="23"/>
+        </w:rPr>
+        <w:t xml:space="preserve">4.6 Juridique et Conformité</w:t>
+      </w:r>
+    </w:p>
+    <w:p>
+      <w:pPr>
+        <w:pStyle w:val="ListParagraph"/>
+        <w:numPr>
+          <w:ilvl w:val="0"/>
+          <w:numId w:val="2"/>
+        </w:numPr>
+        <w:spacing w:after="90"/>
+      </w:pPr>
+      <w:r>
+        <w:rPr>
+          <w:color w:val="1F2937"/>
+          <w:sz w:val="21"/>
+          <w:szCs w:val="21"/>
+        </w:rPr>
+        <w:t xml:space="preserve">Rechercher rapidement une clause, une réglementation ou un précédent dans un corpus de textes volumineux, avec la référence exacte du texte source citée à chaque réponse.</w:t>
+      </w:r>
+    </w:p>
+    <w:p>
+      <w:pPr>
+        <w:pStyle w:val="ListParagraph"/>
+        <w:numPr>
+          <w:ilvl w:val="0"/>
+          <w:numId w:val="2"/>
+        </w:numPr>
+        <w:spacing w:after="90"/>
+      </w:pPr>
+      <w:r>
+        <w:rPr>
+          <w:color w:val="1F2937"/>
+          <w:sz w:val="21"/>
+          <w:szCs w:val="21"/>
+        </w:rPr>
+        <w:t xml:space="preserve">Accélérer la revue de contrats types ou de politiques internes en permettant à un juriste de poser une question précise plutôt que de relire l'intégralité d'un document pour retrouver une clause.</w:t>
+      </w:r>
+    </w:p>
+    <w:p>
+      <w:pPr>
+        <w:pStyle w:val="ListParagraph"/>
+        <w:numPr>
+          <w:ilvl w:val="0"/>
+          <w:numId w:val="2"/>
+        </w:numPr>
+        <w:spacing w:after="90"/>
+      </w:pPr>
+      <w:r>
+        <w:rPr>
+          <w:color w:val="1F2937"/>
+          <w:sz w:val="21"/>
+          <w:szCs w:val="21"/>
+        </w:rPr>
+        <w:t xml:space="preserve">Uniformiser l'interprétation des procédures de conformité au sein d'une organisation : la même question posée par deux collaborateurs différents obtient une réponse cohérente, ancrée dans les mêmes textes de référence.</w:t>
+      </w:r>
+    </w:p>
+    <w:p>
+      <w:pPr>
+        <w:pStyle w:val="Heading2"/>
+        <w:spacing w:after="140" w:before="320"/>
+      </w:pPr>
+      <w:r>
+        <w:rPr>
+          <w:b/>
+          <w:bCs/>
+          <w:color w:val="1B3F6E"/>
+          <w:sz w:val="23"/>
+          <w:szCs w:val="23"/>
+        </w:rPr>
+        <w:t xml:space="preserve">4.7 Et au-delà</w:t>
       </w:r>
     </w:p>
     <w:p>
@@ -3738,7 +4607,7 @@
           <w:sz w:val="21"/>
           <w:szCs w:val="21"/>
         </w:rPr>
-        <w:t xml:space="preserve">Le même principe s'applique à tout secteur disposant d'une documentation de référence : juridique et conformité (recherche de clauses ou de précédents), secteur public (orientation des usagers vers la bonne procédure réglementaire), formation et pédagogie (réponses sourcées à partir des supports de cours), support client (réponses instantanées à partir des vraies procédures internes, sans attendre un agent humain disponible).</w:t>
+        <w:t xml:space="preserve">Le même principe s'applique à tout secteur disposant d'une documentation de référence : secteur public (orientation des usagers vers la bonne procédure réglementaire), support client (réponses instantanées à partir des vraies procédures internes, sans attendre un agent humain disponible), et plus largement toute organisation dont l'activité repose sur une base documentaire structurée.</w:t>
       </w:r>
     </w:p>
     <w:p>
@@ -3750,7 +4619,7 @@
       <w:pPr>
         <w:pStyle w:val="Heading1"/>
         <w:pBdr>
-          <w:bottom w:val="single" w:color="1E8A99" w:sz="8" w:space="6"/>
+          <w:bottom w:val="single" w:color="E8A020" w:sz="8" w:space="6"/>
         </w:pBdr>
         <w:spacing w:after="200" w:before="480"/>
       </w:pPr>
@@ -3758,7 +4627,7 @@
         <w:rPr>
           <w:b/>
           <w:bCs/>
-          <w:color w:val="10263F"/>
+          <w:color w:val="1B3F6E"/>
           <w:sz w:val="30"/>
           <w:szCs w:val="30"/>
         </w:rPr>
@@ -3774,7 +4643,7 @@
         <w:rPr>
           <w:b/>
           <w:bCs/>
-          <w:color w:val="10263F"/>
+          <w:color w:val="1B3F6E"/>
           <w:sz w:val="23"/>
           <w:szCs w:val="23"/>
         </w:rPr>
@@ -3818,7 +4687,7 @@
         <w:tc>
           <w:tcPr>
             <w:tcW w:type="dxa" w:w="4032"/>
-            <w:shd w:fill="10263F" w:val="clear"/>
+            <w:shd w:fill="1B3F6E" w:val="clear"/>
             <w:tcMar>
               <w:top w:type="dxa" w:w="100"/>
               <w:left w:type="dxa" w:w="120"/>
@@ -3835,14 +4704,14 @@
                 <w:sz w:val="18"/>
                 <w:szCs w:val="18"/>
               </w:rPr>
-              <w:t xml:space="preserve">QUESTIONS PEU EFFICACES</w:t>
+              <w:t xml:space="preserve">Questions peu efficaces</w:t>
             </w:r>
           </w:p>
         </w:tc>
         <w:tc>
           <w:tcPr>
             <w:tcW w:type="dxa" w:w="6048"/>
-            <w:shd w:fill="10263F" w:val="clear"/>
+            <w:shd w:fill="1B3F6E" w:val="clear"/>
             <w:tcMar>
               <w:top w:type="dxa" w:w="100"/>
               <w:left w:type="dxa" w:w="120"/>
@@ -3859,7 +4728,7 @@
                 <w:sz w:val="18"/>
                 <w:szCs w:val="18"/>
               </w:rPr>
-              <w:t xml:space="preserve">QUESTIONS TRÈS EFFICACES</w:t>
+              <w:t xml:space="preserve">Questions très efficaces</w:t>
             </w:r>
           </w:p>
         </w:tc>
@@ -3918,7 +4787,7 @@
         <w:tc>
           <w:tcPr>
             <w:tcW w:type="dxa" w:w="4032"/>
-            <w:shd w:fill="F4F6F9" w:val="clear"/>
+            <w:shd w:fill="F4F4F4" w:val="clear"/>
             <w:tcMar>
               <w:top w:type="dxa" w:w="100"/>
               <w:left w:type="dxa" w:w="120"/>
@@ -3942,7 +4811,7 @@
         <w:tc>
           <w:tcPr>
             <w:tcW w:type="dxa" w:w="6048"/>
-            <w:shd w:fill="F4F6F9" w:val="clear"/>
+            <w:shd w:fill="F4F4F4" w:val="clear"/>
             <w:tcMar>
               <w:top w:type="dxa" w:w="100"/>
               <w:left w:type="dxa" w:w="120"/>
@@ -4018,7 +4887,7 @@
         <w:tc>
           <w:tcPr>
             <w:tcW w:type="dxa" w:w="4032"/>
-            <w:shd w:fill="F4F6F9" w:val="clear"/>
+            <w:shd w:fill="F4F4F4" w:val="clear"/>
             <w:tcMar>
               <w:top w:type="dxa" w:w="100"/>
               <w:left w:type="dxa" w:w="120"/>
@@ -4042,7 +4911,7 @@
         <w:tc>
           <w:tcPr>
             <w:tcW w:type="dxa" w:w="6048"/>
-            <w:shd w:fill="F4F6F9" w:val="clear"/>
+            <w:shd w:fill="F4F4F4" w:val="clear"/>
             <w:tcMar>
               <w:top w:type="dxa" w:w="100"/>
               <w:left w:type="dxa" w:w="120"/>
@@ -4067,6 +4936,11 @@
     </w:tbl>
     <w:p>
       <w:pPr>
+        <w:spacing w:after="200"/>
+      </w:pPr>
+    </w:p>
+    <w:p>
+      <w:pPr>
         <w:pStyle w:val="Heading2"/>
         <w:spacing w:after="140" w:before="320"/>
       </w:pPr>
@@ -4074,7 +4948,7 @@
         <w:rPr>
           <w:b/>
           <w:bCs/>
-          <w:color w:val="10263F"/>
+          <w:color w:val="1B3F6E"/>
           <w:sz w:val="23"/>
           <w:szCs w:val="23"/>
         </w:rPr>
@@ -4107,7 +4981,7 @@
         <w:rPr>
           <w:b/>
           <w:bCs/>
-          <w:color w:val="10263F"/>
+          <w:color w:val="1B3F6E"/>
           <w:sz w:val="23"/>
           <w:szCs w:val="23"/>
         </w:rPr>
@@ -4119,7 +4993,7 @@
         <w:pStyle w:val="ListParagraph"/>
         <w:numPr>
           <w:ilvl w:val="0"/>
-          <w:numId w:val="3"/>
+          <w:numId w:val="4"/>
         </w:numPr>
         <w:spacing w:after="90"/>
       </w:pPr>
@@ -4137,7 +5011,7 @@
         <w:pStyle w:val="ListParagraph"/>
         <w:numPr>
           <w:ilvl w:val="0"/>
-          <w:numId w:val="3"/>
+          <w:numId w:val="4"/>
         </w:numPr>
         <w:spacing w:after="90"/>
       </w:pPr>
@@ -4155,7 +5029,7 @@
         <w:pStyle w:val="ListParagraph"/>
         <w:numPr>
           <w:ilvl w:val="0"/>
-          <w:numId w:val="3"/>
+          <w:numId w:val="4"/>
         </w:numPr>
         <w:spacing w:after="90"/>
       </w:pPr>
@@ -4177,7 +5051,7 @@
         <w:rPr>
           <w:b/>
           <w:bCs/>
-          <w:color w:val="10263F"/>
+          <w:color w:val="1B3F6E"/>
           <w:sz w:val="23"/>
           <w:szCs w:val="23"/>
         </w:rPr>
@@ -4282,7 +5156,7 @@
       <w:pPr>
         <w:pStyle w:val="Heading1"/>
         <w:pBdr>
-          <w:bottom w:val="single" w:color="1E8A99" w:sz="8" w:space="6"/>
+          <w:bottom w:val="single" w:color="E8A020" w:sz="8" w:space="6"/>
         </w:pBdr>
         <w:spacing w:after="200" w:before="480"/>
       </w:pPr>
@@ -4290,7 +5164,7 @@
         <w:rPr>
           <w:b/>
           <w:bCs/>
-          <w:color w:val="10263F"/>
+          <w:color w:val="1B3F6E"/>
           <w:sz w:val="30"/>
           <w:szCs w:val="30"/>
         </w:rPr>
@@ -4306,7 +5180,7 @@
         <w:rPr>
           <w:b/>
           <w:bCs/>
-          <w:color w:val="10263F"/>
+          <w:color w:val="1B3F6E"/>
           <w:sz w:val="23"/>
           <w:szCs w:val="23"/>
         </w:rPr>
@@ -4339,7 +5213,7 @@
         <w:rPr>
           <w:b/>
           <w:bCs/>
-          <w:color w:val="10263F"/>
+          <w:color w:val="1B3F6E"/>
           <w:sz w:val="23"/>
           <w:szCs w:val="23"/>
         </w:rPr>
@@ -4354,7 +5228,7 @@
         <w:rPr>
           <w:b/>
           <w:bCs/>
-          <w:color w:val="1E8A99"/>
+          <w:color w:val="0D7D6B"/>
           <w:sz w:val="21"/>
           <w:szCs w:val="21"/>
         </w:rPr>
@@ -4386,7 +5260,7 @@
         <w:rPr>
           <w:b/>
           <w:bCs/>
-          <w:color w:val="1E8A99"/>
+          <w:color w:val="0D7D6B"/>
           <w:sz w:val="21"/>
           <w:szCs w:val="21"/>
         </w:rPr>
@@ -4418,7 +5292,7 @@
         <w:rPr>
           <w:b/>
           <w:bCs/>
-          <w:color w:val="1E8A99"/>
+          <w:color w:val="0D7D6B"/>
           <w:sz w:val="21"/>
           <w:szCs w:val="21"/>
         </w:rPr>
@@ -4450,7 +5324,7 @@
         <w:rPr>
           <w:b/>
           <w:bCs/>
-          <w:color w:val="1E8A99"/>
+          <w:color w:val="0D7D6B"/>
           <w:sz w:val="21"/>
           <w:szCs w:val="21"/>
         </w:rPr>
@@ -4482,7 +5356,7 @@
         <w:rPr>
           <w:b/>
           <w:bCs/>
-          <w:color w:val="1E8A99"/>
+          <w:color w:val="0D7D6B"/>
           <w:sz w:val="21"/>
           <w:szCs w:val="21"/>
         </w:rPr>
@@ -4514,7 +5388,7 @@
         <w:rPr>
           <w:b/>
           <w:bCs/>
-          <w:color w:val="1E8A99"/>
+          <w:color w:val="0D7D6B"/>
           <w:sz w:val="21"/>
           <w:szCs w:val="21"/>
         </w:rPr>
@@ -4546,7 +5420,7 @@
         <w:rPr>
           <w:b/>
           <w:bCs/>
-          <w:color w:val="1E8A99"/>
+          <w:color w:val="0D7D6B"/>
           <w:sz w:val="21"/>
           <w:szCs w:val="21"/>
         </w:rPr>
@@ -4571,15 +5445,10 @@
       </w:r>
     </w:p>
     <w:p>
-      <w:r>
-        <w:br w:type="page"/>
-      </w:r>
-    </w:p>
-    <w:p>
       <w:pPr>
         <w:pStyle w:val="Heading1"/>
         <w:pBdr>
-          <w:bottom w:val="single" w:color="1E8A99" w:sz="8" w:space="6"/>
+          <w:bottom w:val="single" w:color="E8A020" w:sz="8" w:space="6"/>
         </w:pBdr>
         <w:spacing w:after="200" w:before="480"/>
       </w:pPr>
@@ -4587,7 +5456,7 @@
         <w:rPr>
           <w:b/>
           <w:bCs/>
-          <w:color w:val="10263F"/>
+          <w:color w:val="1B3F6E"/>
           <w:sz w:val="30"/>
           <w:szCs w:val="30"/>
         </w:rPr>
@@ -4603,7 +5472,7 @@
         <w:rPr>
           <w:b/>
           <w:bCs/>
-          <w:color w:val="10263F"/>
+          <w:color w:val="1B3F6E"/>
           <w:sz w:val="23"/>
           <w:szCs w:val="23"/>
         </w:rPr>
@@ -4643,7 +5512,7 @@
           <w:sz w:val="21"/>
           <w:szCs w:val="21"/>
         </w:rPr>
-        <w:t xml:space="preserve">Ce n'est pas réservé à l'informatique : tous les métiers peuvent en bénéficier dès qu'ils s'appuient sur une documentation de référence — RH, Finance, Transport &amp; Logistique, Santé, et bien d'autres.</w:t>
+        <w:t xml:space="preserve">Ce n'est pas réservé à l'informatique : tous les métiers peuvent en bénéficier dès qu'ils s'appuient sur une documentation de référence — RH, Finance, Transport &amp; Logistique, Santé, Éducation, Juridique, et bien d'autres.</w:t>
       </w:r>
     </w:p>
     <w:p>
@@ -4709,7 +5578,7 @@
         <w:rPr>
           <w:b/>
           <w:bCs/>
-          <w:color w:val="10263F"/>
+          <w:color w:val="1B3F6E"/>
           <w:sz w:val="23"/>
           <w:szCs w:val="23"/>
         </w:rPr>
@@ -4788,9 +5657,14 @@
       </w:r>
     </w:p>
     <w:sectPr>
+      <w:headerReference w:type="default" r:id="rId7"/>
+      <w:headerReference w:type="first" r:id="rId8"/>
+      <w:footerReference w:type="default" r:id="rId9"/>
+      <w:footerReference w:type="first" r:id="rId10"/>
       <w:pgSz w:w="12240" w:h="15840" w:orient="portrait"/>
-      <w:pgMar w:top="1080" w:right="1080" w:bottom="1080" w:left="1080" w:header="708" w:footer="708" w:gutter="0"/>
+      <w:pgMar w:top="1080" w:right="1080" w:bottom="1200" w:left="1080" w:header="708" w:footer="708" w:gutter="0"/>
       <w:pgNumType/>
+      <w:titlePg/>
       <w:docGrid w:linePitch="360"/>
     </w:sectPr>
   </w:body>
@@ -4838,6 +5712,56 @@
 </w:endnotes>
 </file>
 
+<file path=word/footer1.xml><?xml version="1.0" encoding="utf-8"?>
+<w:ftr xmlns:wpc="http://schemas.microsoft.com/office/word/2010/wordprocessingCanvas" xmlns:mc="http://schemas.openxmlformats.org/markup-compatibility/2006" xmlns:o="urn:schemas-microsoft-com:office:office" xmlns:r="http://schemas.openxmlformats.org/officeDocument/2006/relationships" xmlns:m="http://schemas.openxmlformats.org/officeDocument/2006/math" xmlns:v="urn:schemas-microsoft-com:vml" xmlns:wp14="http://schemas.microsoft.com/office/word/2010/wordprocessingDrawing" xmlns:wp="http://schemas.openxmlformats.org/drawingml/2006/wordprocessingDrawing" xmlns:w10="urn:schemas-microsoft-com:office:word" xmlns:w="http://schemas.openxmlformats.org/wordprocessingml/2006/main" xmlns:w14="http://schemas.microsoft.com/office/word/2010/wordml" xmlns:w15="http://schemas.microsoft.com/office/word/2012/wordml" xmlns:wpg="http://schemas.microsoft.com/office/word/2010/wordprocessingGroup" xmlns:wpi="http://schemas.microsoft.com/office/word/2010/wordprocessingInk" xmlns:wne="http://schemas.microsoft.com/office/word/2006/wordml" xmlns:wps="http://schemas.microsoft.com/office/word/2010/wordprocessingShape">
+  <w:p>
+    <w:pPr>
+      <w:pBdr>
+        <w:top w:val="single" w:color="CCCCCC" w:sz="4" w:space="4"/>
+      </w:pBdr>
+      <w:tabs>
+        <w:tab w:val="right" w:pos="10080"/>
+      </w:tabs>
+    </w:pPr>
+    <w:r>
+      <w:rPr>
+        <w:i/>
+        <w:iCs/>
+        <w:color w:val="6B7280"/>
+        <w:sz w:val="16"/>
+        <w:szCs w:val="16"/>
+      </w:rPr>
+      <w:t xml:space="preserve">contact@transferai.ci  •  www.transferai.ci</w:t>
+    </w:r>
+    <w:r>
+      <w:rPr>
+        <w:color w:val="6B7280"/>
+        <w:sz w:val="16"/>
+        <w:szCs w:val="16"/>
+      </w:rPr>
+      <w:t xml:space="preserve">	Page </w:t>
+    </w:r>
+    <w:r>
+      <w:rPr>
+        <w:color w:val="6B7280"/>
+        <w:sz w:val="16"/>
+        <w:szCs w:val="16"/>
+      </w:rPr>
+      <w:fldChar w:fldCharType="begin"/>
+      <w:instrText xml:space="preserve">PAGE</w:instrText>
+      <w:fldChar w:fldCharType="separate"/>
+      <w:fldChar w:fldCharType="end"/>
+    </w:r>
+  </w:p>
+</w:ftr>
+</file>
+
+<file path=word/footer2.xml><?xml version="1.0" encoding="utf-8"?>
+<w:ftr xmlns:wpc="http://schemas.microsoft.com/office/word/2010/wordprocessingCanvas" xmlns:mc="http://schemas.openxmlformats.org/markup-compatibility/2006" xmlns:o="urn:schemas-microsoft-com:office:office" xmlns:r="http://schemas.openxmlformats.org/officeDocument/2006/relationships" xmlns:m="http://schemas.openxmlformats.org/officeDocument/2006/math" xmlns:v="urn:schemas-microsoft-com:vml" xmlns:wp14="http://schemas.microsoft.com/office/word/2010/wordprocessingDrawing" xmlns:wp="http://schemas.openxmlformats.org/drawingml/2006/wordprocessingDrawing" xmlns:w10="urn:schemas-microsoft-com:office:word" xmlns:w="http://schemas.openxmlformats.org/wordprocessingml/2006/main" xmlns:w14="http://schemas.microsoft.com/office/word/2010/wordml" xmlns:w15="http://schemas.microsoft.com/office/word/2012/wordml" xmlns:wpg="http://schemas.microsoft.com/office/word/2010/wordprocessingGroup" xmlns:wpi="http://schemas.microsoft.com/office/word/2010/wordprocessingInk" xmlns:wne="http://schemas.microsoft.com/office/word/2006/wordml" xmlns:wps="http://schemas.microsoft.com/office/word/2010/wordprocessingShape">
+  <w:p/>
+</w:ftr>
+</file>
+
 <file path=word/footnotes.xml><?xml version="1.0" encoding="utf-8"?>
 <w:footnotes xmlns:wpc="http://schemas.microsoft.com/office/word/2010/wordprocessingCanvas" xmlns:mc="http://schemas.openxmlformats.org/markup-compatibility/2006" xmlns:o="urn:schemas-microsoft-com:office:office" xmlns:r="http://schemas.openxmlformats.org/officeDocument/2006/relationships" xmlns:m="http://schemas.openxmlformats.org/officeDocument/2006/math" xmlns:v="urn:schemas-microsoft-com:vml" xmlns:wp14="http://schemas.microsoft.com/office/word/2010/wordprocessingDrawing" xmlns:wp="http://schemas.openxmlformats.org/drawingml/2006/wordprocessingDrawing" xmlns:w10="urn:schemas-microsoft-com:office:word" xmlns:w="http://schemas.openxmlformats.org/wordprocessingml/2006/main" xmlns:w14="http://schemas.microsoft.com/office/word/2010/wordml" xmlns:w15="http://schemas.microsoft.com/office/word/2012/wordml" xmlns:wpg="http://schemas.microsoft.com/office/word/2010/wordprocessingGroup" xmlns:wpi="http://schemas.microsoft.com/office/word/2010/wordprocessingInk" xmlns:wne="http://schemas.microsoft.com/office/word/2006/wordml" xmlns:wps="http://schemas.microsoft.com/office/word/2010/wordprocessingShape" mc:Ignorable="w14 w15 wp14">
   <w:footnote w:type="separator" w:id="-1">
@@ -4873,6 +5797,45 @@
     </w:p>
   </w:footnote>
 </w:footnotes>
+</file>
+
+<file path=word/header1.xml><?xml version="1.0" encoding="utf-8"?>
+<w:hdr xmlns:wpc="http://schemas.microsoft.com/office/word/2010/wordprocessingCanvas" xmlns:mc="http://schemas.openxmlformats.org/markup-compatibility/2006" xmlns:o="urn:schemas-microsoft-com:office:office" xmlns:r="http://schemas.openxmlformats.org/officeDocument/2006/relationships" xmlns:m="http://schemas.openxmlformats.org/officeDocument/2006/math" xmlns:v="urn:schemas-microsoft-com:vml" xmlns:wp14="http://schemas.microsoft.com/office/word/2010/wordprocessingDrawing" xmlns:wp="http://schemas.openxmlformats.org/drawingml/2006/wordprocessingDrawing" xmlns:w10="urn:schemas-microsoft-com:office:word" xmlns:w="http://schemas.openxmlformats.org/wordprocessingml/2006/main" xmlns:w14="http://schemas.microsoft.com/office/word/2010/wordml" xmlns:w15="http://schemas.microsoft.com/office/word/2012/wordml" xmlns:wpg="http://schemas.microsoft.com/office/word/2010/wordprocessingGroup" xmlns:wpi="http://schemas.microsoft.com/office/word/2010/wordprocessingInk" xmlns:wne="http://schemas.microsoft.com/office/word/2006/wordml" xmlns:wps="http://schemas.microsoft.com/office/word/2010/wordprocessingShape" xmlns:cx="http://schemas.microsoft.com/office/drawing/2014/chartex" xmlns:cx1="http://schemas.microsoft.com/office/drawing/2015/9/8/chartex" xmlns:cx2="http://schemas.microsoft.com/office/drawing/2015/10/21/chartex" xmlns:cx3="http://schemas.microsoft.com/office/drawing/2016/5/9/chartex" xmlns:cx4="http://schemas.microsoft.com/office/drawing/2016/5/10/chartex" xmlns:cx5="http://schemas.microsoft.com/office/drawing/2016/5/11/chartex" xmlns:cx6="http://schemas.microsoft.com/office/drawing/2016/5/12/chartex" xmlns:cx7="http://schemas.microsoft.com/office/drawing/2016/5/13/chartex" xmlns:cx8="http://schemas.microsoft.com/office/drawing/2016/5/14/chartex" xmlns:w16cid="http://schemas.microsoft.com/office/word/2016/wordml/cid" xmlns:w16se="http://schemas.microsoft.com/office/word/2015/wordml/symex">
+  <w:p>
+    <w:pPr>
+      <w:pBdr>
+        <w:bottom w:val="single" w:color="CCCCCC" w:sz="4" w:space="4"/>
+      </w:pBdr>
+      <w:tabs>
+        <w:tab w:val="right" w:pos="10080"/>
+      </w:tabs>
+    </w:pPr>
+    <w:r>
+      <w:rPr>
+        <w:b/>
+        <w:bCs/>
+        <w:color w:val="1B3F6E"/>
+        <w:sz w:val="16"/>
+        <w:szCs w:val="16"/>
+      </w:rPr>
+      <w:t xml:space="preserve">TransferAI Africa — Guide RAG</w:t>
+    </w:r>
+    <w:r>
+      <w:rPr>
+        <w:color w:val="6B7280"/>
+        <w:sz w:val="16"/>
+        <w:szCs w:val="16"/>
+      </w:rPr>
+      <w:t xml:space="preserve">	Cas d'usage &amp; guide réplicable</w:t>
+    </w:r>
+  </w:p>
+</w:hdr>
+</file>
+
+<file path=word/header2.xml><?xml version="1.0" encoding="utf-8"?>
+<w:hdr xmlns:wpc="http://schemas.microsoft.com/office/word/2010/wordprocessingCanvas" xmlns:mc="http://schemas.openxmlformats.org/markup-compatibility/2006" xmlns:o="urn:schemas-microsoft-com:office:office" xmlns:r="http://schemas.openxmlformats.org/officeDocument/2006/relationships" xmlns:m="http://schemas.openxmlformats.org/officeDocument/2006/math" xmlns:v="urn:schemas-microsoft-com:vml" xmlns:wp14="http://schemas.microsoft.com/office/word/2010/wordprocessingDrawing" xmlns:wp="http://schemas.openxmlformats.org/drawingml/2006/wordprocessingDrawing" xmlns:w10="urn:schemas-microsoft-com:office:word" xmlns:w="http://schemas.openxmlformats.org/wordprocessingml/2006/main" xmlns:w14="http://schemas.microsoft.com/office/word/2010/wordml" xmlns:w15="http://schemas.microsoft.com/office/word/2012/wordml" xmlns:wpg="http://schemas.microsoft.com/office/word/2010/wordprocessingGroup" xmlns:wpi="http://schemas.microsoft.com/office/word/2010/wordprocessingInk" xmlns:wne="http://schemas.microsoft.com/office/word/2006/wordml" xmlns:wps="http://schemas.microsoft.com/office/word/2010/wordprocessingShape" xmlns:cx="http://schemas.microsoft.com/office/drawing/2014/chartex" xmlns:cx1="http://schemas.microsoft.com/office/drawing/2015/9/8/chartex" xmlns:cx2="http://schemas.microsoft.com/office/drawing/2015/10/21/chartex" xmlns:cx3="http://schemas.microsoft.com/office/drawing/2016/5/9/chartex" xmlns:cx4="http://schemas.microsoft.com/office/drawing/2016/5/10/chartex" xmlns:cx5="http://schemas.microsoft.com/office/drawing/2016/5/11/chartex" xmlns:cx6="http://schemas.microsoft.com/office/drawing/2016/5/12/chartex" xmlns:cx7="http://schemas.microsoft.com/office/drawing/2016/5/13/chartex" xmlns:cx8="http://schemas.microsoft.com/office/drawing/2016/5/14/chartex" xmlns:w16cid="http://schemas.microsoft.com/office/word/2016/wordml/cid" xmlns:w16se="http://schemas.microsoft.com/office/word/2015/wordml/symex">
+  <w:p/>
+</w:hdr>
 </file>
 
 <file path=word/numbering.xml><?xml version="1.0" encoding="utf-8"?>
@@ -4974,6 +5937,18 @@
     </w:lvl>
   </w:abstractNum>
   <w:abstractNum w:abstractNumId="3" w15:restartNumberingAfterBreak="0">
+    <w:multiLevelType w:val="hybridMultilevel"/>
+    <w:lvl w:ilvl="0" w15:tentative="1">
+      <w:start w:val="1"/>
+      <w:numFmt w:val="decimal"/>
+      <w:lvlText w:val="%1."/>
+      <w:lvlJc w:val="left"/>
+      <w:pPr>
+        <w:ind w:left="360" w:hanging="260"/>
+      </w:pPr>
+    </w:lvl>
+  </w:abstractNum>
+  <w:abstractNum w:abstractNumId="4" w15:restartNumberingAfterBreak="0">
     <w:multiLevelType w:val="hybridMultilevel"/>
     <w:lvl w:ilvl="0" w15:tentative="1">
       <w:start w:val="1"/>
@@ -4999,6 +5974,12 @@
   </w:num>
   <w:num w:numId="3">
     <w:abstractNumId w:val="3"/>
+    <w:lvlOverride w:ilvl="0">
+      <w:startOverride w:val="1"/>
+    </w:lvlOverride>
+  </w:num>
+  <w:num w:numId="4">
+    <w:abstractNumId w:val="4"/>
     <w:lvlOverride w:ilvl="0">
       <w:startOverride w:val="1"/>
     </w:lvlOverride>

</xml_diff>